<commit_message>
added new version of use case but not new photos of it  + new idef0 + er+ started practice part
</commit_message>
<xml_diff>
--- a/Отчет по УП (6) — копия.docx
+++ b/Отчет по УП (6) — копия.docx
@@ -65,7 +65,7 @@
                                 <a14:useLocalDpi xmlns:a14="http://schemas.microsoft.com/office/drawing/2010/main" val="0"/>
                               </a:ext>
                               <a:ext uri="{96DAC541-7B7A-43D3-8B79-37D633B846F1}">
-                                <asvg:svgBlip xmlns:asvg="http://schemas.microsoft.com/office/drawing/2016/SVG/main" xmlns:w16sdtdh="http://schemas.microsoft.com/office/word/2020/wordml/sdtdatahash" xmlns:w16="http://schemas.microsoft.com/office/word/2018/wordml" xmlns:w16cid="http://schemas.microsoft.com/office/word/2016/wordml/cid" xmlns:w16cex="http://schemas.microsoft.com/office/word/2018/wordml/cex" xmlns:w="http://schemas.openxmlformats.org/wordprocessingml/2006/main" xmlns:w10="urn:schemas-microsoft-com:office:word" xmlns:v="urn:schemas-microsoft-com:vml" xmlns:o="urn:schemas-microsoft-com:office:office" xmlns:am3d="http://schemas.microsoft.com/office/drawing/2017/model3d" xmlns:aink="http://schemas.microsoft.com/office/drawing/2016/ink" xmlns:cx8="http://schemas.microsoft.com/office/drawing/2016/5/14/chartex" xmlns:cx7="http://schemas.microsoft.com/office/drawing/2016/5/13/chartex" xmlns:cx6="http://schemas.microsoft.com/office/drawing/2016/5/12/chartex" xmlns:cx5="http://schemas.microsoft.com/office/drawing/2016/5/11/chartex" xmlns:cx4="http://schemas.microsoft.com/office/drawing/2016/5/10/chartex" xmlns:cx3="http://schemas.microsoft.com/office/drawing/2016/5/9/chartex" xmlns:cx2="http://schemas.microsoft.com/office/drawing/2015/10/21/chartex" xmlns="" r:embed="rId9"/>
+                                <asvg:svgBlip xmlns="" xmlns:cx2="http://schemas.microsoft.com/office/drawing/2015/10/21/chartex" xmlns:cx3="http://schemas.microsoft.com/office/drawing/2016/5/9/chartex" xmlns:cx4="http://schemas.microsoft.com/office/drawing/2016/5/10/chartex" xmlns:cx5="http://schemas.microsoft.com/office/drawing/2016/5/11/chartex" xmlns:cx6="http://schemas.microsoft.com/office/drawing/2016/5/12/chartex" xmlns:cx7="http://schemas.microsoft.com/office/drawing/2016/5/13/chartex" xmlns:cx8="http://schemas.microsoft.com/office/drawing/2016/5/14/chartex" xmlns:aink="http://schemas.microsoft.com/office/drawing/2016/ink" xmlns:am3d="http://schemas.microsoft.com/office/drawing/2017/model3d" xmlns:o="urn:schemas-microsoft-com:office:office" xmlns:v="urn:schemas-microsoft-com:vml" xmlns:w10="urn:schemas-microsoft-com:office:word" xmlns:w="http://schemas.openxmlformats.org/wordprocessingml/2006/main" xmlns:w16cex="http://schemas.microsoft.com/office/word/2018/wordml/cex" xmlns:w16cid="http://schemas.microsoft.com/office/word/2016/wordml/cid" xmlns:w16="http://schemas.microsoft.com/office/word/2018/wordml" xmlns:w16sdtdh="http://schemas.microsoft.com/office/word/2020/wordml/sdtdatahash" xmlns:asvg="http://schemas.microsoft.com/office/drawing/2016/SVG/main" r:embed="rId9"/>
                               </a:ext>
                             </a:extLst>
                           </a:blip>
@@ -694,10 +694,10 @@
     <w:sdt>
       <w:sdtPr>
         <w:rPr>
-          <w:rFonts w:asciiTheme="minorHAnsi" w:eastAsiaTheme="minorHAnsi" w:hAnsiTheme="minorHAnsi" w:cstheme="minorBidi"/>
+          <w:rFonts w:ascii="Times New Roman" w:eastAsiaTheme="minorHAnsi" w:hAnsi="Times New Roman" w:cs="Times New Roman"/>
           <w:color w:val="auto"/>
-          <w:sz w:val="22"/>
-          <w:szCs w:val="22"/>
+          <w:sz w:val="28"/>
+          <w:szCs w:val="28"/>
           <w:lang w:eastAsia="en-US"/>
         </w:rPr>
         <w:id w:val="1840657372"/>
@@ -716,13 +716,18 @@
         <w:p>
           <w:pPr>
             <w:pStyle w:val="ae"/>
+            <w:numPr>
+              <w:ilvl w:val="0"/>
+              <w:numId w:val="0"/>
+            </w:numPr>
             <w:spacing w:after="360"/>
+            <w:ind w:left="720"/>
             <w:jc w:val="center"/>
             <w:rPr>
               <w:rFonts w:ascii="Times New Roman" w:hAnsi="Times New Roman" w:cs="Times New Roman"/>
               <w:b/>
               <w:color w:val="000000" w:themeColor="text1"/>
-              <w:sz w:val="24"/>
+              <w:sz w:val="28"/>
               <w:szCs w:val="28"/>
             </w:rPr>
           </w:pPr>
@@ -731,7 +736,7 @@
               <w:rFonts w:ascii="Times New Roman" w:hAnsi="Times New Roman" w:cs="Times New Roman"/>
               <w:b/>
               <w:color w:val="000000" w:themeColor="text1"/>
-              <w:sz w:val="24"/>
+              <w:sz w:val="28"/>
               <w:szCs w:val="28"/>
             </w:rPr>
             <w:t>СОДЕРЖАНИЕ</w:t>
@@ -741,6 +746,7 @@
           <w:pPr>
             <w:pStyle w:val="11"/>
             <w:tabs>
+              <w:tab w:val="left" w:pos="440"/>
               <w:tab w:val="right" w:leader="dot" w:pos="9628"/>
             </w:tabs>
             <w:rPr>
@@ -750,20 +756,50 @@
             </w:rPr>
           </w:pPr>
           <w:r>
+            <w:rPr>
+              <w:rFonts w:ascii="Times New Roman" w:hAnsi="Times New Roman" w:cs="Times New Roman"/>
+              <w:sz w:val="28"/>
+              <w:szCs w:val="28"/>
+            </w:rPr>
             <w:fldChar w:fldCharType="begin"/>
           </w:r>
           <w:r>
+            <w:rPr>
+              <w:rFonts w:ascii="Times New Roman" w:hAnsi="Times New Roman" w:cs="Times New Roman"/>
+              <w:sz w:val="28"/>
+              <w:szCs w:val="28"/>
+            </w:rPr>
             <w:instrText xml:space="preserve"> TOC \o "1-3" \h \z \u </w:instrText>
           </w:r>
           <w:r>
+            <w:rPr>
+              <w:rFonts w:ascii="Times New Roman" w:hAnsi="Times New Roman" w:cs="Times New Roman"/>
+              <w:sz w:val="28"/>
+              <w:szCs w:val="28"/>
+            </w:rPr>
             <w:fldChar w:fldCharType="separate"/>
           </w:r>
-          <w:hyperlink w:anchor="_Toc224494889" w:history="1">
+          <w:hyperlink w:anchor="_Toc225708673" w:history="1">
             <w:r>
               <w:rPr>
                 <w:rStyle w:val="a4"/>
                 <w:noProof/>
               </w:rPr>
+              <w:t>1)</w:t>
+            </w:r>
+            <w:r>
+              <w:rPr>
+                <w:rFonts w:eastAsiaTheme="minorEastAsia"/>
+                <w:noProof/>
+                <w:lang w:eastAsia="ru-RU"/>
+              </w:rPr>
+              <w:tab/>
+            </w:r>
+            <w:r>
+              <w:rPr>
+                <w:rStyle w:val="a4"/>
+                <w:noProof/>
+              </w:rPr>
               <w:t>ВВЕДЕНИЕ</w:t>
             </w:r>
             <w:r>
@@ -785,7 +821,7 @@
                 <w:noProof/>
                 <w:webHidden/>
               </w:rPr>
-              <w:instrText xml:space="preserve"> PAGEREF _Toc224494889 \h </w:instrText>
+              <w:instrText xml:space="preserve"> PAGEREF _Toc225708673 \h </w:instrText>
             </w:r>
             <w:r>
               <w:rPr>
@@ -820,6 +856,7 @@
           <w:pPr>
             <w:pStyle w:val="11"/>
             <w:tabs>
+              <w:tab w:val="left" w:pos="440"/>
               <w:tab w:val="right" w:leader="dot" w:pos="9628"/>
             </w:tabs>
             <w:rPr>
@@ -828,12 +865,27 @@
               <w:lang w:eastAsia="ru-RU"/>
             </w:rPr>
           </w:pPr>
-          <w:hyperlink w:anchor="_Toc224494890" w:history="1">
+          <w:hyperlink w:anchor="_Toc225708674" w:history="1">
             <w:r>
               <w:rPr>
                 <w:rStyle w:val="a4"/>
                 <w:noProof/>
               </w:rPr>
+              <w:t>2)</w:t>
+            </w:r>
+            <w:r>
+              <w:rPr>
+                <w:rFonts w:eastAsiaTheme="minorEastAsia"/>
+                <w:noProof/>
+                <w:lang w:eastAsia="ru-RU"/>
+              </w:rPr>
+              <w:tab/>
+            </w:r>
+            <w:r>
+              <w:rPr>
+                <w:rStyle w:val="a4"/>
+                <w:noProof/>
+              </w:rPr>
               <w:t>СОДЕРЖАНИЕ УЧЕБНОЙ ПРАКТИКИ</w:t>
             </w:r>
             <w:r>
@@ -855,7 +907,7 @@
                 <w:noProof/>
                 <w:webHidden/>
               </w:rPr>
-              <w:instrText xml:space="preserve"> PAGEREF _Toc224494890 \h </w:instrText>
+              <w:instrText xml:space="preserve"> PAGEREF _Toc225708674 \h </w:instrText>
             </w:r>
             <w:r>
               <w:rPr>
@@ -898,7 +950,7 @@
               <w:lang w:eastAsia="ru-RU"/>
             </w:rPr>
           </w:pPr>
-          <w:hyperlink w:anchor="_Toc224494891" w:history="1">
+          <w:hyperlink w:anchor="_Toc225708675" w:history="1">
             <w:r>
               <w:rPr>
                 <w:rStyle w:val="a4"/>
@@ -925,7 +977,7 @@
                 <w:noProof/>
                 <w:webHidden/>
               </w:rPr>
-              <w:instrText xml:space="preserve"> PAGEREF _Toc224494891 \h </w:instrText>
+              <w:instrText xml:space="preserve"> PAGEREF _Toc225708675 \h </w:instrText>
             </w:r>
             <w:r>
               <w:rPr>
@@ -968,7 +1020,7 @@
               <w:lang w:eastAsia="ru-RU"/>
             </w:rPr>
           </w:pPr>
-          <w:hyperlink w:anchor="_Toc224494892" w:history="1">
+          <w:hyperlink w:anchor="_Toc225708676" w:history="1">
             <w:r>
               <w:rPr>
                 <w:rStyle w:val="a4"/>
@@ -983,6 +1035,8 @@
               </w:rPr>
               <w:tab/>
             </w:r>
+            <w:bookmarkStart w:id="0" w:name="_GoBack"/>
+            <w:bookmarkEnd w:id="0"/>
             <w:r>
               <w:rPr>
                 <w:noProof/>
@@ -995,7 +1049,7 @@
                 <w:noProof/>
                 <w:webHidden/>
               </w:rPr>
-              <w:instrText xml:space="preserve"> PAGEREF _Toc224494892 \h </w:instrText>
+              <w:instrText xml:space="preserve"> PAGEREF _Toc225708676 \h </w:instrText>
             </w:r>
             <w:r>
               <w:rPr>
@@ -1038,7 +1092,7 @@
               <w:lang w:eastAsia="ru-RU"/>
             </w:rPr>
           </w:pPr>
-          <w:hyperlink w:anchor="_Toc224494893" w:history="1">
+          <w:hyperlink w:anchor="_Toc225708677" w:history="1">
             <w:r>
               <w:rPr>
                 <w:rStyle w:val="a4"/>
@@ -1095,7 +1149,7 @@
                 <w:noProof/>
                 <w:webHidden/>
               </w:rPr>
-              <w:instrText xml:space="preserve"> PAGEREF _Toc224494893 \h </w:instrText>
+              <w:instrText xml:space="preserve"> PAGEREF _Toc225708677 \h </w:instrText>
             </w:r>
             <w:r>
               <w:rPr>
@@ -1138,7 +1192,7 @@
               <w:lang w:eastAsia="ru-RU"/>
             </w:rPr>
           </w:pPr>
-          <w:hyperlink w:anchor="_Toc224494894" w:history="1">
+          <w:hyperlink w:anchor="_Toc225708678" w:history="1">
             <w:r>
               <w:rPr>
                 <w:rStyle w:val="a4"/>
@@ -1152,14 +1206,14 @@
                 <w:noProof/>
                 <w:lang w:val="en-US"/>
               </w:rPr>
-              <w:t xml:space="preserve">idef0 </w:t>
+              <w:t>idef</w:t>
             </w:r>
             <w:r>
               <w:rPr>
                 <w:rStyle w:val="a4"/>
                 <w:noProof/>
               </w:rPr>
-              <w:t>диаграммы</w:t>
+              <w:t>0 диаграммы</w:t>
             </w:r>
             <w:r>
               <w:rPr>
@@ -1180,7 +1234,7 @@
                 <w:noProof/>
                 <w:webHidden/>
               </w:rPr>
-              <w:instrText xml:space="preserve"> PAGEREF _Toc224494894 \h </w:instrText>
+              <w:instrText xml:space="preserve"> PAGEREF _Toc225708678 \h </w:instrText>
             </w:r>
             <w:r>
               <w:rPr>
@@ -1218,10 +1272,12 @@
               <w:tab w:val="right" w:leader="dot" w:pos="9628"/>
             </w:tabs>
             <w:rPr>
+              <w:rFonts w:eastAsiaTheme="minorEastAsia"/>
               <w:noProof/>
+              <w:lang w:eastAsia="ru-RU"/>
             </w:rPr>
           </w:pPr>
-          <w:hyperlink w:anchor="_Toc224494895" w:history="1">
+          <w:hyperlink w:anchor="_Toc225708679" w:history="1">
             <w:r>
               <w:rPr>
                 <w:rStyle w:val="a4"/>
@@ -1248,7 +1304,7 @@
                 <w:noProof/>
                 <w:webHidden/>
               </w:rPr>
-              <w:instrText xml:space="preserve"> PAGEREF _Toc224494895 \h </w:instrText>
+              <w:instrText xml:space="preserve"> PAGEREF _Toc225708679 \h </w:instrText>
             </w:r>
             <w:r>
               <w:rPr>
@@ -1281,7 +1337,7 @@
         </w:p>
         <w:p>
           <w:pPr>
-            <w:pStyle w:val="11"/>
+            <w:pStyle w:val="21"/>
             <w:tabs>
               <w:tab w:val="right" w:leader="dot" w:pos="9628"/>
             </w:tabs>
@@ -1291,13 +1347,13 @@
               <w:lang w:eastAsia="ru-RU"/>
             </w:rPr>
           </w:pPr>
-          <w:hyperlink w:anchor="_Toc224494896" w:history="1">
+          <w:hyperlink w:anchor="_Toc225708680" w:history="1">
             <w:r>
               <w:rPr>
                 <w:rStyle w:val="a4"/>
                 <w:noProof/>
               </w:rPr>
-              <w:t>ЗАКЛЮЧЕНИЕ</w:t>
+              <w:t>ER диаграмма</w:t>
             </w:r>
             <w:r>
               <w:rPr>
@@ -1318,7 +1374,7 @@
                 <w:noProof/>
                 <w:webHidden/>
               </w:rPr>
-              <w:instrText xml:space="preserve"> PAGEREF _Toc224494896 \h </w:instrText>
+              <w:instrText xml:space="preserve"> PAGEREF _Toc225708680 \h </w:instrText>
             </w:r>
             <w:r>
               <w:rPr>
@@ -1338,7 +1394,7 @@
                 <w:noProof/>
                 <w:webHidden/>
               </w:rPr>
-              <w:t>12</w:t>
+              <w:t>13</w:t>
             </w:r>
             <w:r>
               <w:rPr>
@@ -1351,7 +1407,7 @@
         </w:p>
         <w:p>
           <w:pPr>
-            <w:pStyle w:val="11"/>
+            <w:pStyle w:val="21"/>
             <w:tabs>
               <w:tab w:val="right" w:leader="dot" w:pos="9628"/>
             </w:tabs>
@@ -1361,13 +1417,256 @@
               <w:lang w:eastAsia="ru-RU"/>
             </w:rPr>
           </w:pPr>
-          <w:hyperlink w:anchor="_Toc224494897" w:history="1">
+          <w:hyperlink w:anchor="_Toc225708681" w:history="1">
+            <w:r>
+              <w:rPr>
+                <w:rStyle w:val="a4"/>
+                <w:noProof/>
+              </w:rPr>
+              <w:t>Выбор программных средств реализаций</w:t>
+            </w:r>
+            <w:r>
+              <w:rPr>
+                <w:noProof/>
+                <w:webHidden/>
+              </w:rPr>
+              <w:tab/>
+            </w:r>
+            <w:r>
+              <w:rPr>
+                <w:noProof/>
+                <w:webHidden/>
+              </w:rPr>
+              <w:fldChar w:fldCharType="begin"/>
+            </w:r>
+            <w:r>
+              <w:rPr>
+                <w:noProof/>
+                <w:webHidden/>
+              </w:rPr>
+              <w:instrText xml:space="preserve"> PAGEREF _Toc225708681 \h </w:instrText>
+            </w:r>
+            <w:r>
+              <w:rPr>
+                <w:noProof/>
+                <w:webHidden/>
+              </w:rPr>
+            </w:r>
+            <w:r>
+              <w:rPr>
+                <w:noProof/>
+                <w:webHidden/>
+              </w:rPr>
+              <w:fldChar w:fldCharType="separate"/>
+            </w:r>
+            <w:r>
+              <w:rPr>
+                <w:noProof/>
+                <w:webHidden/>
+              </w:rPr>
+              <w:t>16</w:t>
+            </w:r>
+            <w:r>
+              <w:rPr>
+                <w:noProof/>
+                <w:webHidden/>
+              </w:rPr>
+              <w:fldChar w:fldCharType="end"/>
+            </w:r>
+          </w:hyperlink>
+        </w:p>
+        <w:p>
+          <w:pPr>
+            <w:pStyle w:val="21"/>
+            <w:tabs>
+              <w:tab w:val="right" w:leader="dot" w:pos="9628"/>
+            </w:tabs>
+            <w:rPr>
+              <w:rFonts w:eastAsiaTheme="minorEastAsia"/>
+              <w:noProof/>
+              <w:lang w:eastAsia="ru-RU"/>
+            </w:rPr>
+          </w:pPr>
+          <w:hyperlink w:anchor="_Toc225708682" w:history="1">
+            <w:r>
+              <w:rPr>
+                <w:rStyle w:val="a4"/>
+                <w:noProof/>
+              </w:rPr>
+              <w:t>Практическая реализация</w:t>
+            </w:r>
+            <w:r>
+              <w:rPr>
+                <w:noProof/>
+                <w:webHidden/>
+              </w:rPr>
+              <w:tab/>
+            </w:r>
+            <w:r>
+              <w:rPr>
+                <w:noProof/>
+                <w:webHidden/>
+              </w:rPr>
+              <w:fldChar w:fldCharType="begin"/>
+            </w:r>
+            <w:r>
+              <w:rPr>
+                <w:noProof/>
+                <w:webHidden/>
+              </w:rPr>
+              <w:instrText xml:space="preserve"> PAGEREF _Toc225708682 \h </w:instrText>
+            </w:r>
+            <w:r>
+              <w:rPr>
+                <w:noProof/>
+                <w:webHidden/>
+              </w:rPr>
+            </w:r>
+            <w:r>
+              <w:rPr>
+                <w:noProof/>
+                <w:webHidden/>
+              </w:rPr>
+              <w:fldChar w:fldCharType="separate"/>
+            </w:r>
+            <w:r>
+              <w:rPr>
+                <w:noProof/>
+                <w:webHidden/>
+              </w:rPr>
+              <w:t>19</w:t>
+            </w:r>
+            <w:r>
+              <w:rPr>
+                <w:noProof/>
+                <w:webHidden/>
+              </w:rPr>
+              <w:fldChar w:fldCharType="end"/>
+            </w:r>
+          </w:hyperlink>
+        </w:p>
+        <w:p>
+          <w:pPr>
+            <w:pStyle w:val="11"/>
+            <w:tabs>
+              <w:tab w:val="left" w:pos="440"/>
+              <w:tab w:val="right" w:leader="dot" w:pos="9628"/>
+            </w:tabs>
+            <w:rPr>
+              <w:rFonts w:eastAsiaTheme="minorEastAsia"/>
+              <w:noProof/>
+              <w:lang w:eastAsia="ru-RU"/>
+            </w:rPr>
+          </w:pPr>
+          <w:hyperlink w:anchor="_Toc225708683" w:history="1">
+            <w:r>
+              <w:rPr>
+                <w:rStyle w:val="a4"/>
+                <w:noProof/>
+              </w:rPr>
+              <w:t>3)</w:t>
+            </w:r>
+            <w:r>
+              <w:rPr>
+                <w:rFonts w:eastAsiaTheme="minorEastAsia"/>
+                <w:noProof/>
+                <w:lang w:eastAsia="ru-RU"/>
+              </w:rPr>
+              <w:tab/>
+            </w:r>
+            <w:r>
+              <w:rPr>
+                <w:rStyle w:val="a4"/>
+                <w:noProof/>
+              </w:rPr>
+              <w:t>ЗАКЛЮЧЕНИЕ</w:t>
+            </w:r>
+            <w:r>
+              <w:rPr>
+                <w:noProof/>
+                <w:webHidden/>
+              </w:rPr>
+              <w:tab/>
+            </w:r>
+            <w:r>
+              <w:rPr>
+                <w:noProof/>
+                <w:webHidden/>
+              </w:rPr>
+              <w:fldChar w:fldCharType="begin"/>
+            </w:r>
+            <w:r>
+              <w:rPr>
+                <w:noProof/>
+                <w:webHidden/>
+              </w:rPr>
+              <w:instrText xml:space="preserve"> PAGEREF _Toc225708683 \h </w:instrText>
+            </w:r>
+            <w:r>
+              <w:rPr>
+                <w:noProof/>
+                <w:webHidden/>
+              </w:rPr>
+            </w:r>
+            <w:r>
+              <w:rPr>
+                <w:noProof/>
+                <w:webHidden/>
+              </w:rPr>
+              <w:fldChar w:fldCharType="separate"/>
+            </w:r>
+            <w:r>
+              <w:rPr>
+                <w:noProof/>
+                <w:webHidden/>
+              </w:rPr>
+              <w:t>20</w:t>
+            </w:r>
+            <w:r>
+              <w:rPr>
+                <w:noProof/>
+                <w:webHidden/>
+              </w:rPr>
+              <w:fldChar w:fldCharType="end"/>
+            </w:r>
+          </w:hyperlink>
+        </w:p>
+        <w:p>
+          <w:pPr>
+            <w:pStyle w:val="11"/>
+            <w:tabs>
+              <w:tab w:val="left" w:pos="440"/>
+              <w:tab w:val="right" w:leader="dot" w:pos="9628"/>
+            </w:tabs>
+            <w:rPr>
+              <w:rFonts w:eastAsiaTheme="minorEastAsia"/>
+              <w:noProof/>
+              <w:lang w:eastAsia="ru-RU"/>
+            </w:rPr>
+          </w:pPr>
+          <w:hyperlink w:anchor="_Toc225708684" w:history="1">
             <w:r>
               <w:rPr>
                 <w:rStyle w:val="a4"/>
                 <w:rFonts w:eastAsiaTheme="majorEastAsia"/>
                 <w:noProof/>
               </w:rPr>
+              <w:t>4)</w:t>
+            </w:r>
+            <w:r>
+              <w:rPr>
+                <w:rFonts w:eastAsiaTheme="minorEastAsia"/>
+                <w:noProof/>
+                <w:lang w:eastAsia="ru-RU"/>
+              </w:rPr>
+              <w:tab/>
+            </w:r>
+            <w:r>
+              <w:rPr>
+                <w:rStyle w:val="a4"/>
+                <w:rFonts w:eastAsiaTheme="majorEastAsia"/>
+                <w:noProof/>
+              </w:rPr>
               <w:t>СПИСОК ИСПОЛЬЗОВАННЫХ ИСТОЧНИКОВ</w:t>
             </w:r>
             <w:r>
@@ -1389,7 +1688,7 @@
                 <w:noProof/>
                 <w:webHidden/>
               </w:rPr>
-              <w:instrText xml:space="preserve"> PAGEREF _Toc224494897 \h </w:instrText>
+              <w:instrText xml:space="preserve"> PAGEREF _Toc225708684 \h </w:instrText>
             </w:r>
             <w:r>
               <w:rPr>
@@ -1409,7 +1708,7 @@
                 <w:noProof/>
                 <w:webHidden/>
               </w:rPr>
-              <w:t>13</w:t>
+              <w:t>21</w:t>
             </w:r>
             <w:r>
               <w:rPr>
@@ -1423,8 +1722,11 @@
         <w:p>
           <w:r>
             <w:rPr>
+              <w:rFonts w:ascii="Times New Roman" w:hAnsi="Times New Roman" w:cs="Times New Roman"/>
               <w:b/>
               <w:bCs/>
+              <w:sz w:val="28"/>
+              <w:szCs w:val="28"/>
             </w:rPr>
             <w:fldChar w:fldCharType="end"/>
           </w:r>
@@ -1563,19 +1865,13 @@
       <w:pPr>
         <w:pStyle w:val="1"/>
         <w:jc w:val="center"/>
-        <w:rPr>
-          <w:sz w:val="28"/>
-        </w:rPr>
-      </w:pPr>
-      <w:bookmarkStart w:id="0" w:name="_Toc224494889"/>
-      <w:r>
-        <w:rPr>
-          <w:sz w:val="28"/>
-        </w:rPr>
+      </w:pPr>
+      <w:bookmarkStart w:id="1" w:name="_Toc225708673"/>
+      <w:r>
         <w:lastRenderedPageBreak/>
         <w:t>ВВЕДЕНИЕ</w:t>
       </w:r>
-      <w:bookmarkEnd w:id="0"/>
+      <w:bookmarkEnd w:id="1"/>
     </w:p>
     <w:p>
       <w:pPr>
@@ -1664,30 +1960,28 @@
         <w:pStyle w:val="1"/>
         <w:jc w:val="center"/>
         <w:rPr>
-          <w:sz w:val="28"/>
-          <w:szCs w:val="28"/>
-        </w:rPr>
-      </w:pPr>
-      <w:bookmarkStart w:id="1" w:name="_Toc224494890"/>
-      <w:r>
-        <w:rPr>
-          <w:sz w:val="28"/>
+          <w:szCs w:val="28"/>
+        </w:rPr>
+      </w:pPr>
+      <w:bookmarkStart w:id="2" w:name="_Toc225708674"/>
+      <w:r>
+        <w:rPr>
           <w:szCs w:val="28"/>
         </w:rPr>
         <w:lastRenderedPageBreak/>
         <w:t>СОДЕРЖАНИЕ УЧЕБНОЙ ПРАКТИКИ</w:t>
       </w:r>
-      <w:bookmarkEnd w:id="1"/>
+      <w:bookmarkEnd w:id="2"/>
     </w:p>
     <w:p>
       <w:pPr>
         <w:pStyle w:val="2"/>
       </w:pPr>
-      <w:bookmarkStart w:id="2" w:name="_Toc224494891"/>
+      <w:bookmarkStart w:id="3" w:name="_Toc225708675"/>
       <w:r>
         <w:t>Описание предметной области</w:t>
       </w:r>
-      <w:bookmarkEnd w:id="2"/>
+      <w:bookmarkEnd w:id="3"/>
     </w:p>
     <w:p>
       <w:pPr>
@@ -1832,11 +2126,11 @@
       <w:pPr>
         <w:pStyle w:val="2"/>
       </w:pPr>
-      <w:bookmarkStart w:id="3" w:name="_Toc224494892"/>
+      <w:bookmarkStart w:id="4" w:name="_Toc225708676"/>
       <w:r>
         <w:t>Обзор аналогов</w:t>
       </w:r>
-      <w:bookmarkEnd w:id="3"/>
+      <w:bookmarkEnd w:id="4"/>
       <w:r>
         <w:br/>
       </w:r>
@@ -2362,7 +2656,7 @@
       <w:pPr>
         <w:pStyle w:val="2"/>
       </w:pPr>
-      <w:bookmarkStart w:id="4" w:name="_Toc224494893"/>
+      <w:bookmarkStart w:id="5" w:name="_Toc225708677"/>
       <w:r>
         <w:t xml:space="preserve">Разработка </w:t>
       </w:r>
@@ -2387,7 +2681,7 @@
       <w:r>
         <w:t>диаграммы</w:t>
       </w:r>
-      <w:bookmarkEnd w:id="4"/>
+      <w:bookmarkEnd w:id="5"/>
       <w:r>
         <w:br/>
       </w:r>
@@ -2621,7 +2915,35 @@
           <w:szCs w:val="28"/>
         </w:rPr>
         <w:lastRenderedPageBreak/>
-        <w:t>ознакомление со сведениями об образовательной организации, просмотр списка специальностей, а также возможность заказа справок. Данные функции позволяют посетителям сайта получить актуальную информацию о деятельности колледжа и образовательных программах.</w:t>
+        <w:t>ознакомление со сведениями об образовательной организации, просмотр списка специальностей, а также возможность заказа справок</w:t>
+      </w:r>
+      <w:r>
+        <w:rPr>
+          <w:sz w:val="28"/>
+          <w:szCs w:val="28"/>
+        </w:rPr>
+        <w:t xml:space="preserve"> </w:t>
+      </w:r>
+      <w:r>
+        <w:rPr>
+          <w:sz w:val="28"/>
+          <w:szCs w:val="28"/>
+        </w:rPr>
+        <w:t>и оставить сообщение о проблемах колледжа</w:t>
+      </w:r>
+      <w:r>
+        <w:rPr>
+          <w:sz w:val="28"/>
+          <w:szCs w:val="28"/>
+        </w:rPr>
+        <w:t>. Данные функции позволяют посетителям сайта получить актуальную информацию о деятельности коллед</w:t>
+      </w:r>
+      <w:r>
+        <w:rPr>
+          <w:sz w:val="28"/>
+          <w:szCs w:val="28"/>
+        </w:rPr>
+        <w:t>жа и образовательных программах, а также взаимодействовать с образовательным учреждением.</w:t>
       </w:r>
     </w:p>
     <w:p>
@@ -2634,13 +2956,6 @@
           <w:szCs w:val="28"/>
         </w:rPr>
       </w:pPr>
-      <w:r>
-        <w:rPr>
-          <w:sz w:val="28"/>
-          <w:szCs w:val="28"/>
-        </w:rPr>
-        <w:t>Актор «Admin» выполняет функции управления сайтом и его содержимым. Администратор осуществляет вход в административную панель сайта, где получает доступ к инструментам управления контентом. Через панель администратора возможен просмотр списка страниц, добавление новостей, а также управление установленными плагинами.</w:t>
-      </w:r>
     </w:p>
     <w:p>
       <w:pPr>
@@ -2657,7 +2972,7 @@
           <w:sz w:val="28"/>
           <w:szCs w:val="28"/>
         </w:rPr>
-        <w:t>Отдельным вариантом использования является изменение контента страницы. Данный вариант использования может включать несколько дополнительных операций, таких как создание новой страницы, удаление страницы и изменение структуры страницы. Эти действия представлены на диаграмме с использованием отношения расширения (&lt;&gt;), что означает возможность выполнения дополнительных операций в рамках основного процесса редактирования контента.</w:t>
+        <w:t>Актор «Admin» выполняет функции управления сайтом и его содержимым. Администратор осуществляет вход в административную панель сайта, где получает доступ к инструментам управления контентом. Через панель администратора возможен просмотр списка страниц, добавление новостей, а также управление установленными плагинами.</w:t>
       </w:r>
     </w:p>
     <w:p>
@@ -2675,6 +2990,24 @@
           <w:sz w:val="28"/>
           <w:szCs w:val="28"/>
         </w:rPr>
+        <w:t>Отдельным вариантом использования является изменение контента страницы. Данный вариант использования может включать несколько дополнительных операций, таких как создание новой страницы, удаление страницы и изменение структуры страницы. Эти действия представлены на диаграмме с использованием отношения расширения, что означает возможность выполнения дополнительных операций в рамках основного процесса редактирования контента.</w:t>
+      </w:r>
+    </w:p>
+    <w:p>
+      <w:pPr>
+        <w:pStyle w:val="isselectedend"/>
+        <w:spacing w:before="0" w:beforeAutospacing="0" w:after="0" w:afterAutospacing="0" w:line="360" w:lineRule="auto"/>
+        <w:ind w:firstLine="709"/>
+        <w:rPr>
+          <w:sz w:val="28"/>
+          <w:szCs w:val="28"/>
+        </w:rPr>
+      </w:pPr>
+      <w:r>
+        <w:rPr>
+          <w:sz w:val="28"/>
+          <w:szCs w:val="28"/>
+        </w:rPr>
         <w:t>Также администратор может управлять функциональными возможностями сайта посредством работы с плагинами. Для этого предусмотрены варианты использования установки новых плагинов и удаления существующих. Эти действия также связаны отношением расширения, поскольку выполняются в рамках общего процесса управления плагинами.</w:t>
       </w:r>
     </w:p>
@@ -2707,7 +3040,7 @@
       <w:pPr>
         <w:pStyle w:val="2"/>
       </w:pPr>
-      <w:bookmarkStart w:id="5" w:name="_Toc224494894"/>
+      <w:bookmarkStart w:id="6" w:name="_Toc225708678"/>
       <w:r>
         <w:t xml:space="preserve">Разработка </w:t>
       </w:r>
@@ -2715,12 +3048,15 @@
         <w:rPr>
           <w:lang w:val="en-US"/>
         </w:rPr>
-        <w:t xml:space="preserve">idef0 </w:t>
+        <w:t>idef</w:t>
+      </w:r>
+      <w:r>
+        <w:t xml:space="preserve">0 </w:t>
       </w:r>
       <w:r>
         <w:t>диаграммы</w:t>
       </w:r>
-      <w:bookmarkEnd w:id="5"/>
+      <w:bookmarkEnd w:id="6"/>
     </w:p>
     <w:p>
       <w:pPr>
@@ -2737,15 +3073,8 @@
           <w:sz w:val="28"/>
           <w:szCs w:val="28"/>
         </w:rPr>
-        <w:t xml:space="preserve">Для проектирования функциональной структуры информационной системы сайта колледжа была использована методология IDEF0 (Integration Definition for Function Modeling). Данная методология предназначена для </w:t>
-      </w:r>
-      <w:r>
-        <w:rPr>
-          <w:sz w:val="28"/>
-          <w:szCs w:val="28"/>
-        </w:rPr>
         <w:lastRenderedPageBreak/>
-        <w:t>построения функциональных моделей и позволяет наглядно представить процессы, происходящие в системе, а также связи между ними.</w:t>
+        <w:t>Для проектирования функциональной структуры информационной системы сайта колледжа была использована методология IDEF0 (Integration Definition for Function Modeling). Данная методология предназначена для построения функциональных моделей и позволяет наглядно представить процессы, происходящие в системе, а также связи между ними.</w:t>
       </w:r>
     </w:p>
     <w:p>
@@ -2754,36 +3083,80 @@
         <w:spacing w:before="0" w:beforeAutospacing="0" w:after="0" w:afterAutospacing="0" w:line="360" w:lineRule="auto"/>
         <w:ind w:firstLine="709"/>
         <w:rPr>
-          <w:sz w:val="28"/>
-          <w:szCs w:val="28"/>
-        </w:rPr>
-      </w:pPr>
-      <w:r>
-        <w:rPr>
-          <w:sz w:val="28"/>
-          <w:szCs w:val="28"/>
+          <w:noProof/>
+        </w:rPr>
+      </w:pPr>
+      <w:r>
+        <w:rPr>
+          <w:sz w:val="28"/>
+          <w:szCs w:val="28"/>
+        </w:rPr>
+        <w:t xml:space="preserve">Применение IDEF0 позволяет создавать структурированную документацию, которая может использоваться как на этапе проектирования системы, так и при её дальнейшем развитии и модернизации. Контекстная диаграмма представляет систему в виде единого функционального блока без детализации внутренних процессов. Центральный функциональный блок имеет название </w:t>
+      </w:r>
+      <w:r>
+        <w:rPr>
+          <w:rStyle w:val="a6"/>
+          <w:b w:val="0"/>
+          <w:sz w:val="28"/>
+          <w:szCs w:val="28"/>
+        </w:rPr>
+        <w:t>«Информационная система сайта колледжа»</w:t>
+      </w:r>
+      <w:r>
+        <w:rPr>
+          <w:sz w:val="28"/>
+          <w:szCs w:val="28"/>
+        </w:rPr>
+        <w:t xml:space="preserve"> и обозначается как </w:t>
+      </w:r>
+      <w:r>
+        <w:rPr>
+          <w:rStyle w:val="a6"/>
+          <w:b w:val="0"/>
+          <w:sz w:val="28"/>
+          <w:szCs w:val="28"/>
+        </w:rPr>
+        <w:t>A0</w:t>
+      </w:r>
+      <w:r>
+        <w:rPr>
+          <w:rStyle w:val="a6"/>
+          <w:b w:val="0"/>
+          <w:sz w:val="28"/>
+          <w:szCs w:val="28"/>
+        </w:rPr>
+        <w:t>(Рисунок 2)</w:t>
+      </w:r>
+      <w:r>
+        <w:rPr>
+          <w:b/>
+          <w:sz w:val="28"/>
+          <w:szCs w:val="28"/>
+        </w:rPr>
+        <w:t>.</w:t>
+      </w:r>
+      <w:r>
+        <w:rPr>
+          <w:sz w:val="28"/>
+          <w:szCs w:val="28"/>
+        </w:rPr>
+        <w:t xml:space="preserve"> Основная задача данного блока заключается в обработке поступающей информации и предоставлении пользователям актуальных данных через веб-интерфейс.</w:t>
+      </w:r>
+      <w:r>
+        <w:rPr>
+          <w:noProof/>
+        </w:rPr>
+        <w:t xml:space="preserve"> </w:t>
+      </w:r>
+      <w:r>
+        <w:rPr>
+          <w:noProof/>
         </w:rPr>
         <w:drawing>
-          <wp:anchor distT="0" distB="0" distL="114300" distR="114300" simplePos="0" relativeHeight="251658240" behindDoc="0" locked="0" layoutInCell="1" allowOverlap="1" wp14:anchorId="0AE1E894" wp14:editId="443B828A">
-            <wp:simplePos x="0" y="0"/>
-            <wp:positionH relativeFrom="column">
-              <wp:posOffset>-158115</wp:posOffset>
-            </wp:positionH>
-            <wp:positionV relativeFrom="paragraph">
-              <wp:posOffset>2758440</wp:posOffset>
-            </wp:positionV>
-            <wp:extent cx="6120130" cy="3292475"/>
-            <wp:effectExtent l="0" t="0" r="0" b="3175"/>
-            <wp:wrapThrough wrapText="bothSides">
-              <wp:wrapPolygon edited="0">
-                <wp:start x="0" y="0"/>
-                <wp:lineTo x="0" y="21496"/>
-                <wp:lineTo x="21515" y="21496"/>
-                <wp:lineTo x="21515" y="0"/>
-                <wp:lineTo x="0" y="0"/>
-              </wp:wrapPolygon>
-            </wp:wrapThrough>
-            <wp:docPr id="2" name="Рисунок 2"/>
+          <wp:inline distT="0" distB="0" distL="0" distR="0" wp14:anchorId="64BECEE4" wp14:editId="6FF0E385">
+            <wp:extent cx="6120130" cy="2991485"/>
+            <wp:effectExtent l="0" t="0" r="0" b="0"/>
+            <wp:docPr id="8" name="Рисунок 8"/>
             <wp:cNvGraphicFramePr>
               <a:graphicFrameLocks xmlns:a="http://schemas.openxmlformats.org/drawingml/2006/main" noChangeAspect="1"/>
             </wp:cNvGraphicFramePr>
@@ -2795,13 +3168,7 @@
                     <pic:cNvPicPr/>
                   </pic:nvPicPr>
                   <pic:blipFill>
-                    <a:blip r:embed="rId11" cstate="print">
-                      <a:extLst>
-                        <a:ext uri="{28A0092B-C50C-407E-A947-70E740481C1C}">
-                          <a14:useLocalDpi xmlns:a14="http://schemas.microsoft.com/office/drawing/2010/main" val="0"/>
-                        </a:ext>
-                      </a:extLst>
-                    </a:blip>
+                    <a:blip r:embed="rId11"/>
                     <a:stretch>
                       <a:fillRect/>
                     </a:stretch>
@@ -2809,7 +3176,7 @@
                   <pic:spPr>
                     <a:xfrm>
                       <a:off x="0" y="0"/>
-                      <a:ext cx="6120130" cy="3292475"/>
+                      <a:ext cx="6120130" cy="2991485"/>
                     </a:xfrm>
                     <a:prstGeom prst="rect">
                       <a:avLst/>
@@ -2818,99 +3185,20 @@
                 </pic:pic>
               </a:graphicData>
             </a:graphic>
-            <wp14:sizeRelH relativeFrom="page">
-              <wp14:pctWidth>0</wp14:pctWidth>
-            </wp14:sizeRelH>
-            <wp14:sizeRelV relativeFrom="page">
-              <wp14:pctHeight>0</wp14:pctHeight>
-            </wp14:sizeRelV>
-          </wp:anchor>
+          </wp:inline>
         </w:drawing>
       </w:r>
-      <w:r>
-        <w:rPr>
-          <w:sz w:val="28"/>
-          <w:szCs w:val="28"/>
-        </w:rPr>
-        <w:t>Применение IDEF0 позволяет создавать структурированную документацию, которая может использоваться как на этапе проектирования системы, так и при её дальнейшем развитии и модернизации.</w:t>
-      </w:r>
-      <w:r>
-        <w:rPr>
-          <w:sz w:val="28"/>
-          <w:szCs w:val="28"/>
-        </w:rPr>
-        <w:t xml:space="preserve"> </w:t>
-      </w:r>
-      <w:r>
-        <w:rPr>
-          <w:sz w:val="28"/>
-          <w:szCs w:val="28"/>
-        </w:rPr>
-        <w:t>Контекстная диаграмма представляет систему в виде единого функционального блока без детализации внутренних процессов</w:t>
-      </w:r>
-      <w:r>
-        <w:rPr>
-          <w:sz w:val="28"/>
-          <w:szCs w:val="28"/>
-        </w:rPr>
-        <w:t xml:space="preserve">. </w:t>
-      </w:r>
-      <w:r>
-        <w:rPr>
-          <w:sz w:val="28"/>
-          <w:szCs w:val="28"/>
-        </w:rPr>
-        <w:t xml:space="preserve">Центральный функциональный блок имеет название </w:t>
-      </w:r>
-      <w:r>
-        <w:rPr>
-          <w:rStyle w:val="a6"/>
-          <w:b w:val="0"/>
-          <w:sz w:val="28"/>
-          <w:szCs w:val="28"/>
-        </w:rPr>
-        <w:t>«Информационная система сайта колледжа»</w:t>
-      </w:r>
-      <w:r>
-        <w:rPr>
-          <w:sz w:val="28"/>
-          <w:szCs w:val="28"/>
-        </w:rPr>
-        <w:t xml:space="preserve"> и обозначается как </w:t>
-      </w:r>
-      <w:r>
-        <w:rPr>
-          <w:rStyle w:val="a6"/>
-          <w:b w:val="0"/>
-          <w:sz w:val="28"/>
-          <w:szCs w:val="28"/>
-        </w:rPr>
-        <w:t>A0</w:t>
-      </w:r>
-      <w:r>
-        <w:rPr>
-          <w:rStyle w:val="a6"/>
-          <w:b w:val="0"/>
-          <w:sz w:val="28"/>
-          <w:szCs w:val="28"/>
-        </w:rPr>
-        <w:t>(Рисунок 2)</w:t>
-      </w:r>
-      <w:r>
-        <w:rPr>
-          <w:b/>
-          <w:sz w:val="28"/>
-          <w:szCs w:val="28"/>
-        </w:rPr>
-        <w:t>.</w:t>
-      </w:r>
-      <w:r>
-        <w:rPr>
-          <w:sz w:val="28"/>
-          <w:szCs w:val="28"/>
-        </w:rPr>
-        <w:t xml:space="preserve"> Основная задача данного блока заключается в обработке поступающей информации и предоставлении пользователям актуальных данных через веб-интерфейс.</w:t>
-      </w:r>
+    </w:p>
+    <w:p>
+      <w:pPr>
+        <w:pStyle w:val="a5"/>
+        <w:spacing w:before="0" w:beforeAutospacing="0" w:after="0" w:afterAutospacing="0" w:line="360" w:lineRule="auto"/>
+        <w:ind w:firstLine="709"/>
+        <w:rPr>
+          <w:sz w:val="28"/>
+          <w:szCs w:val="28"/>
+        </w:rPr>
+      </w:pPr>
     </w:p>
     <w:p>
       <w:pPr>
@@ -2964,15 +3252,8 @@
           <w:sz w:val="28"/>
           <w:szCs w:val="28"/>
         </w:rPr>
-        <w:t xml:space="preserve">В качестве управляющих воздействий выступают техническое задание, определяющее требования к разработке системы, а также Федеральный закон </w:t>
-      </w:r>
-      <w:r>
-        <w:rPr>
-          <w:sz w:val="28"/>
-          <w:szCs w:val="28"/>
-        </w:rPr>
         <w:lastRenderedPageBreak/>
-        <w:t>№152-ФЗ «О персональных данных», регламентирующий порядок обработки персональной информации пользователей.</w:t>
+        <w:t>В качестве управляющих воздействий выступают техническое задание, определяющее требования к разработке системы, а также Федеральный закон №152-ФЗ «О персональных данных», регламентирующий порядок обработки персональной информации пользователей.</w:t>
       </w:r>
     </w:p>
     <w:p>
@@ -3015,18 +3296,18 @@
       <w:pPr>
         <w:pStyle w:val="3"/>
       </w:pPr>
-      <w:bookmarkStart w:id="6" w:name="_Toc224494895"/>
+      <w:bookmarkStart w:id="7" w:name="_Toc225708679"/>
       <w:r>
         <w:t>Декомпозиция первого уровня</w:t>
       </w:r>
-      <w:bookmarkEnd w:id="6"/>
+      <w:bookmarkEnd w:id="7"/>
       <w:r>
         <w:br/>
       </w:r>
     </w:p>
     <w:p>
       <w:pPr>
-        <w:pStyle w:val="a5"/>
+        <w:pStyle w:val="isselectedend"/>
         <w:spacing w:before="0" w:beforeAutospacing="0" w:after="0" w:afterAutospacing="0" w:line="360" w:lineRule="auto"/>
         <w:ind w:firstLine="709"/>
         <w:rPr>
@@ -3056,45 +3337,21 @@
           <w:sz w:val="28"/>
           <w:szCs w:val="28"/>
         </w:rPr>
-        <w:t xml:space="preserve"> детализации основной процесс A0 разбивается на несколько функциональных блоков. Такая декомпозиция позволяет более подробно рассмотреть внутреннюю структуру системы и определить основные этапы обработки информации</w:t>
-      </w:r>
-      <w:r>
-        <w:rPr>
-          <w:sz w:val="28"/>
-          <w:szCs w:val="28"/>
-        </w:rPr>
-        <w:t>.</w:t>
-      </w:r>
-      <w:r>
-        <w:rPr>
-          <w:sz w:val="28"/>
-          <w:szCs w:val="28"/>
-        </w:rPr>
-        <w:t xml:space="preserve"> </w:t>
-      </w:r>
-      <w:r>
-        <w:rPr>
-          <w:sz w:val="28"/>
-          <w:szCs w:val="28"/>
-        </w:rPr>
-        <w:t>Функциональный блок A1 отвечает за формирование и поддержку структуры веб-сайта. В рамках данного процесса осуществляется создание страниц, настройка разделов сайта и организация навигационной структуры.</w:t>
-      </w:r>
-    </w:p>
-    <w:p>
-      <w:pPr>
-        <w:rPr>
-          <w:rFonts w:ascii="Times New Roman" w:eastAsia="Times New Roman" w:hAnsi="Times New Roman" w:cs="Times New Roman"/>
-          <w:sz w:val="28"/>
-          <w:szCs w:val="28"/>
-          <w:lang w:eastAsia="ru-RU"/>
-        </w:rPr>
-      </w:pPr>
-      <w:r>
-        <w:rPr>
-          <w:sz w:val="28"/>
-          <w:szCs w:val="28"/>
-        </w:rPr>
-        <w:br w:type="page"/>
+        <w:t xml:space="preserve"> детализации основной процесс A0 разбивается на несколько функциональных блоков</w:t>
+      </w:r>
+      <w:r>
+        <w:rPr>
+          <w:sz w:val="28"/>
+          <w:szCs w:val="28"/>
+        </w:rPr>
+        <w:t xml:space="preserve">. </w:t>
+      </w:r>
+      <w:r>
+        <w:rPr>
+          <w:sz w:val="28"/>
+          <w:szCs w:val="28"/>
+        </w:rPr>
+        <w:t>A1 — «Управление пользователем», A2 — «Управление плагинами системы» и A3 — «Управление контентом страницы». Данная декомпозиция позволяет более детально рассмотреть процессы, происходящие в информационной системе сайта колледжа, а также определить взаимосвязи между ними.</w:t>
       </w:r>
     </w:p>
     <w:p>
@@ -3115,26 +3372,18 @@
         </w:rPr>
         <w:lastRenderedPageBreak/>
         <w:drawing>
-          <wp:anchor distT="0" distB="0" distL="114300" distR="114300" simplePos="0" relativeHeight="251659264" behindDoc="0" locked="0" layoutInCell="1" allowOverlap="1" wp14:anchorId="3E296DAB" wp14:editId="504E7C5C">
+          <wp:anchor distT="0" distB="0" distL="114300" distR="114300" simplePos="0" relativeHeight="251659264" behindDoc="0" locked="0" layoutInCell="1" allowOverlap="1" wp14:anchorId="4A99243C" wp14:editId="700FF12E">
             <wp:simplePos x="0" y="0"/>
             <wp:positionH relativeFrom="column">
-              <wp:posOffset>17145</wp:posOffset>
+              <wp:posOffset>40005</wp:posOffset>
             </wp:positionH>
             <wp:positionV relativeFrom="paragraph">
               <wp:posOffset>0</wp:posOffset>
             </wp:positionV>
-            <wp:extent cx="6120130" cy="3271520"/>
-            <wp:effectExtent l="0" t="0" r="0" b="5080"/>
-            <wp:wrapThrough wrapText="bothSides">
-              <wp:wrapPolygon edited="0">
-                <wp:start x="0" y="0"/>
-                <wp:lineTo x="0" y="21508"/>
-                <wp:lineTo x="21515" y="21508"/>
-                <wp:lineTo x="21515" y="0"/>
-                <wp:lineTo x="0" y="0"/>
-              </wp:wrapPolygon>
-            </wp:wrapThrough>
-            <wp:docPr id="5" name="Рисунок 5"/>
+            <wp:extent cx="6120130" cy="2995295"/>
+            <wp:effectExtent l="0" t="0" r="0" b="0"/>
+            <wp:wrapTopAndBottom/>
+            <wp:docPr id="9" name="Рисунок 9"/>
             <wp:cNvGraphicFramePr>
               <a:graphicFrameLocks xmlns:a="http://schemas.openxmlformats.org/drawingml/2006/main" noChangeAspect="1"/>
             </wp:cNvGraphicFramePr>
@@ -3160,7 +3409,7 @@
                   <pic:spPr>
                     <a:xfrm>
                       <a:off x="0" y="0"/>
-                      <a:ext cx="6120130" cy="3271520"/>
+                      <a:ext cx="6120130" cy="2995295"/>
                     </a:xfrm>
                     <a:prstGeom prst="rect">
                       <a:avLst/>
@@ -3178,14 +3427,186 @@
           </wp:anchor>
         </w:drawing>
       </w:r>
-      <w:bookmarkStart w:id="7" w:name="_GoBack"/>
-      <w:bookmarkEnd w:id="7"/>
       <w:r>
         <w:rPr>
           <w:sz w:val="28"/>
           <w:szCs w:val="28"/>
         </w:rPr>
         <w:t>Рисунок 3</w:t>
+      </w:r>
+    </w:p>
+    <w:p>
+      <w:pPr>
+        <w:pStyle w:val="isselectedend"/>
+        <w:spacing w:before="0" w:beforeAutospacing="0" w:after="0" w:afterAutospacing="0" w:line="360" w:lineRule="auto"/>
+        <w:ind w:firstLine="709"/>
+        <w:rPr>
+          <w:sz w:val="28"/>
+          <w:szCs w:val="28"/>
+        </w:rPr>
+      </w:pPr>
+    </w:p>
+    <w:p>
+      <w:pPr>
+        <w:spacing w:after="0" w:line="360" w:lineRule="auto"/>
+        <w:ind w:firstLine="709"/>
+        <w:rPr>
+          <w:rFonts w:ascii="Times New Roman" w:eastAsia="Times New Roman" w:hAnsi="Times New Roman" w:cs="Times New Roman"/>
+          <w:sz w:val="28"/>
+          <w:szCs w:val="28"/>
+          <w:lang w:eastAsia="ru-RU"/>
+        </w:rPr>
+      </w:pPr>
+      <w:r>
+        <w:rPr>
+          <w:rFonts w:ascii="Times New Roman" w:eastAsia="Times New Roman" w:hAnsi="Times New Roman" w:cs="Times New Roman"/>
+          <w:sz w:val="28"/>
+          <w:szCs w:val="28"/>
+          <w:lang w:eastAsia="ru-RU"/>
+        </w:rPr>
+        <w:t>Блок A1 «Управление пользователем» отвечает за обработку данных пользователей системы. Входным потоком для данного блока являются данные пользователя. Управляющими воздействиями выступают техническое задание и требования законодательства, в частности Федеральный закон №152-ФЗ «О персональных данных». В результате работы блока формируется информация о пользователе, которая может использоваться другими компонентами системы. Основная роль в реализации данного процесса принадлежит администратору.</w:t>
+      </w:r>
+    </w:p>
+    <w:p>
+      <w:pPr>
+        <w:spacing w:after="0" w:line="360" w:lineRule="auto"/>
+        <w:ind w:firstLine="709"/>
+        <w:rPr>
+          <w:rFonts w:ascii="Times New Roman" w:eastAsia="Times New Roman" w:hAnsi="Times New Roman" w:cs="Times New Roman"/>
+          <w:sz w:val="28"/>
+          <w:szCs w:val="28"/>
+          <w:lang w:eastAsia="ru-RU"/>
+        </w:rPr>
+      </w:pPr>
+      <w:r>
+        <w:rPr>
+          <w:rFonts w:ascii="Times New Roman" w:eastAsia="Times New Roman" w:hAnsi="Times New Roman" w:cs="Times New Roman"/>
+          <w:sz w:val="28"/>
+          <w:szCs w:val="28"/>
+          <w:lang w:eastAsia="ru-RU"/>
+        </w:rPr>
+        <w:t>Блок A2 «Управление плагинами системы» предназначен для настройки и расширения функциональных возможностей сайта. Входными данными являются сведения о плагинах и информация о пользователях, поступающая из блока A1. Управляющие воздействия аналогичны предыдущему блоку и включают техническое задание и нормативные требования. В результате работы блока формируется информация об установленных плагинах, которая передаётся в блок A3. Данный процесс также реализуется администратором системы.</w:t>
+      </w:r>
+    </w:p>
+    <w:p>
+      <w:pPr>
+        <w:spacing w:after="0" w:line="360" w:lineRule="auto"/>
+        <w:ind w:firstLine="709"/>
+        <w:rPr>
+          <w:rFonts w:ascii="Times New Roman" w:eastAsia="Times New Roman" w:hAnsi="Times New Roman" w:cs="Times New Roman"/>
+          <w:sz w:val="28"/>
+          <w:szCs w:val="28"/>
+          <w:lang w:eastAsia="ru-RU"/>
+        </w:rPr>
+      </w:pPr>
+      <w:r>
+        <w:rPr>
+          <w:rFonts w:ascii="Times New Roman" w:eastAsia="Times New Roman" w:hAnsi="Times New Roman" w:cs="Times New Roman"/>
+          <w:sz w:val="28"/>
+          <w:szCs w:val="28"/>
+          <w:lang w:eastAsia="ru-RU"/>
+        </w:rPr>
+        <w:t xml:space="preserve">Блок A3 «Управление контентом страницы» является ключевым элементом системы, обеспечивающим наполнение сайта информацией. Входные данные включают новости колледжа, информацию о занятиях, </w:t>
+      </w:r>
+      <w:r>
+        <w:rPr>
+          <w:rFonts w:ascii="Times New Roman" w:eastAsia="Times New Roman" w:hAnsi="Times New Roman" w:cs="Times New Roman"/>
+          <w:sz w:val="28"/>
+          <w:szCs w:val="28"/>
+          <w:lang w:eastAsia="ru-RU"/>
+        </w:rPr>
+        <w:lastRenderedPageBreak/>
+        <w:t>медиафайлы, а также сведения об установленны</w:t>
+      </w:r>
+      <w:r>
+        <w:rPr>
+          <w:rFonts w:ascii="Times New Roman" w:eastAsia="Times New Roman" w:hAnsi="Times New Roman" w:cs="Times New Roman"/>
+          <w:sz w:val="28"/>
+          <w:szCs w:val="28"/>
+          <w:lang w:eastAsia="ru-RU"/>
+        </w:rPr>
+        <w:t xml:space="preserve"> </w:t>
+      </w:r>
+      <w:r>
+        <w:rPr>
+          <w:rFonts w:ascii="Times New Roman" w:eastAsia="Times New Roman" w:hAnsi="Times New Roman" w:cs="Times New Roman"/>
+          <w:sz w:val="28"/>
+          <w:szCs w:val="28"/>
+          <w:lang w:eastAsia="ru-RU"/>
+        </w:rPr>
+        <w:tab/>
+      </w:r>
+      <w:r>
+        <w:rPr>
+          <w:rFonts w:ascii="Times New Roman" w:eastAsia="Times New Roman" w:hAnsi="Times New Roman" w:cs="Times New Roman"/>
+          <w:sz w:val="28"/>
+          <w:szCs w:val="28"/>
+          <w:lang w:eastAsia="ru-RU"/>
+        </w:rPr>
+        <w:t>х плагинах, поступающие из блока A2. Управляющие воздействия представлены техническим заданием и требованиями законодательства.</w:t>
+      </w:r>
+    </w:p>
+    <w:p>
+      <w:pPr>
+        <w:spacing w:after="0" w:line="360" w:lineRule="auto"/>
+        <w:ind w:firstLine="709"/>
+        <w:rPr>
+          <w:rFonts w:ascii="Times New Roman" w:eastAsia="Times New Roman" w:hAnsi="Times New Roman" w:cs="Times New Roman"/>
+          <w:sz w:val="28"/>
+          <w:szCs w:val="28"/>
+          <w:lang w:eastAsia="ru-RU"/>
+        </w:rPr>
+      </w:pPr>
+      <w:r>
+        <w:rPr>
+          <w:rFonts w:ascii="Times New Roman" w:eastAsia="Times New Roman" w:hAnsi="Times New Roman" w:cs="Times New Roman"/>
+          <w:sz w:val="28"/>
+          <w:szCs w:val="28"/>
+          <w:lang w:eastAsia="ru-RU"/>
+        </w:rPr>
+        <w:t>В результате функционирования блока A3 формируются выходные данные системы, к которым относятся опубликованные новости колледжа, информация о колледже, план занятий и список страниц сайта. Эти данные становятся доступными для пользователей через веб-интерфейс.</w:t>
+      </w:r>
+    </w:p>
+    <w:p>
+      <w:pPr>
+        <w:spacing w:after="0" w:line="360" w:lineRule="auto"/>
+        <w:ind w:firstLine="709"/>
+        <w:rPr>
+          <w:rFonts w:ascii="Times New Roman" w:eastAsia="Times New Roman" w:hAnsi="Times New Roman" w:cs="Times New Roman"/>
+          <w:sz w:val="28"/>
+          <w:szCs w:val="28"/>
+          <w:lang w:eastAsia="ru-RU"/>
+        </w:rPr>
+      </w:pPr>
+      <w:r>
+        <w:rPr>
+          <w:rFonts w:ascii="Times New Roman" w:eastAsia="Times New Roman" w:hAnsi="Times New Roman" w:cs="Times New Roman"/>
+          <w:sz w:val="28"/>
+          <w:szCs w:val="28"/>
+          <w:lang w:eastAsia="ru-RU"/>
+        </w:rPr>
+        <w:t>Между функциональными блоками установлены следующие связи: от блока A1 к блоку A2 передаётся информация о пользователе, обеспечивающая корректную работу системы управления плагинами; от блока A2 к блоку A3 передаётся информация об установленных плагинах, необходимая для управления контентом сайта. Таким образом, обеспечивается последовательная обработка данных — от управления пользователями и настройкой системы до формирования и публикации контента.</w:t>
+      </w:r>
+    </w:p>
+    <w:p>
+      <w:pPr>
+        <w:spacing w:after="0" w:line="360" w:lineRule="auto"/>
+        <w:ind w:firstLine="709"/>
+        <w:rPr>
+          <w:rFonts w:ascii="Times New Roman" w:eastAsia="Times New Roman" w:hAnsi="Times New Roman" w:cs="Times New Roman"/>
+          <w:sz w:val="28"/>
+          <w:szCs w:val="28"/>
+          <w:lang w:eastAsia="ru-RU"/>
+        </w:rPr>
+      </w:pPr>
+      <w:r>
+        <w:rPr>
+          <w:rFonts w:ascii="Times New Roman" w:eastAsia="Times New Roman" w:hAnsi="Times New Roman" w:cs="Times New Roman"/>
+          <w:sz w:val="28"/>
+          <w:szCs w:val="28"/>
+          <w:lang w:eastAsia="ru-RU"/>
+        </w:rPr>
+        <w:t>Представленная декомпозиция позволяет структурировать основные процессы информационной системы и отражает логическую последовательность её функционирования.</w:t>
       </w:r>
     </w:p>
     <w:p>
@@ -3203,7 +3624,326 @@
           <w:sz w:val="28"/>
           <w:szCs w:val="28"/>
         </w:rPr>
-        <w:t>Входными данными для блока являются новости, медиафайлы, информация о колледже и сведения о расписании занятий. Управляющими элементами выступают техническое задание и требования законодательства.</w:t>
+        <w:br w:type="page"/>
+      </w:r>
+    </w:p>
+    <w:p>
+      <w:pPr>
+        <w:pStyle w:val="isselectedend"/>
+        <w:spacing w:before="0" w:beforeAutospacing="0" w:after="0" w:afterAutospacing="0" w:line="360" w:lineRule="auto"/>
+        <w:ind w:firstLine="709"/>
+        <w:rPr>
+          <w:sz w:val="28"/>
+          <w:szCs w:val="28"/>
+        </w:rPr>
+      </w:pPr>
+      <w:bookmarkStart w:id="8" w:name="_Toc225708680"/>
+      <w:r>
+        <w:rPr>
+          <w:rStyle w:val="20"/>
+        </w:rPr>
+        <w:lastRenderedPageBreak/>
+        <w:t>ER диаграмма</w:t>
+      </w:r>
+      <w:bookmarkEnd w:id="8"/>
+      <w:r>
+        <w:rPr>
+          <w:rStyle w:val="20"/>
+        </w:rPr>
+        <w:br/>
+      </w:r>
+      <w:r>
+        <w:rPr>
+          <w:sz w:val="28"/>
+          <w:szCs w:val="28"/>
+        </w:rPr>
+        <w:t>Одним из ключевых этапов проектирования информационной системы является разработка структуры базы данных. Для наглядного представления сущностей системы, их атрибутов и взаимосвязей используется ER-диаграмма (диаграмма «сущность–связь»).</w:t>
+      </w:r>
+    </w:p>
+    <w:p>
+      <w:pPr>
+        <w:pStyle w:val="isselectedend"/>
+        <w:spacing w:before="0" w:beforeAutospacing="0" w:after="0" w:afterAutospacing="0" w:line="360" w:lineRule="auto"/>
+        <w:ind w:firstLine="709"/>
+        <w:rPr>
+          <w:sz w:val="28"/>
+          <w:szCs w:val="28"/>
+        </w:rPr>
+      </w:pPr>
+      <w:r>
+        <w:rPr>
+          <w:sz w:val="28"/>
+          <w:szCs w:val="28"/>
+        </w:rPr>
+        <w:t>Построение ER-диаграммы позволяет формализовать структуру хранимых данных, определить основные таблицы базы данных и установить связи между ними. Это, в свою очередь, упрощает процесс разработки системы, обеспечивает целостность данных и повышает удобство их дальнейшего использования.</w:t>
+      </w:r>
+    </w:p>
+    <w:p>
+      <w:pPr>
+        <w:pStyle w:val="isselectedend"/>
+        <w:spacing w:before="0" w:beforeAutospacing="0" w:after="0" w:afterAutospacing="0" w:line="360" w:lineRule="auto"/>
+        <w:ind w:firstLine="709"/>
+        <w:rPr>
+          <w:sz w:val="28"/>
+          <w:szCs w:val="28"/>
+        </w:rPr>
+      </w:pPr>
+      <w:r>
+        <w:rPr>
+          <w:sz w:val="28"/>
+          <w:szCs w:val="28"/>
+        </w:rPr>
+        <w:t>В рамках данной работы ER-диаграмма отражает структуру базы данных сайта колледжа и демонстрирует организацию хранения информации, связанной с пользователями, контентом, комментариями и другими элементами системы.</w:t>
+      </w:r>
+      <w:r>
+        <w:rPr>
+          <w:sz w:val="28"/>
+          <w:szCs w:val="28"/>
+        </w:rPr>
+        <w:t xml:space="preserve"> Диаграмма представлена ниже (Рисунок 4, Рисунок 5).</w:t>
+      </w:r>
+    </w:p>
+    <w:p>
+      <w:pPr>
+        <w:pStyle w:val="isselectedend"/>
+        <w:spacing w:before="0" w:beforeAutospacing="0" w:after="0" w:afterAutospacing="0" w:line="360" w:lineRule="auto"/>
+        <w:ind w:firstLine="709"/>
+        <w:jc w:val="center"/>
+        <w:rPr>
+          <w:sz w:val="28"/>
+          <w:szCs w:val="28"/>
+        </w:rPr>
+      </w:pPr>
+      <w:r>
+        <w:rPr>
+          <w:noProof/>
+        </w:rPr>
+        <w:lastRenderedPageBreak/>
+        <w:drawing>
+          <wp:anchor distT="0" distB="0" distL="114300" distR="114300" simplePos="0" relativeHeight="251660288" behindDoc="0" locked="0" layoutInCell="1" allowOverlap="1" wp14:anchorId="3A43FE4F" wp14:editId="52754B3E">
+            <wp:simplePos x="0" y="0"/>
+            <wp:positionH relativeFrom="column">
+              <wp:posOffset>-28575</wp:posOffset>
+            </wp:positionH>
+            <wp:positionV relativeFrom="paragraph">
+              <wp:posOffset>0</wp:posOffset>
+            </wp:positionV>
+            <wp:extent cx="6120130" cy="5854700"/>
+            <wp:effectExtent l="0" t="0" r="0" b="0"/>
+            <wp:wrapTopAndBottom/>
+            <wp:docPr id="10" name="Рисунок 10"/>
+            <wp:cNvGraphicFramePr>
+              <a:graphicFrameLocks xmlns:a="http://schemas.openxmlformats.org/drawingml/2006/main" noChangeAspect="1"/>
+            </wp:cNvGraphicFramePr>
+            <a:graphic xmlns:a="http://schemas.openxmlformats.org/drawingml/2006/main">
+              <a:graphicData uri="http://schemas.openxmlformats.org/drawingml/2006/picture">
+                <pic:pic xmlns:pic="http://schemas.openxmlformats.org/drawingml/2006/picture">
+                  <pic:nvPicPr>
+                    <pic:cNvPr id="1" name=""/>
+                    <pic:cNvPicPr/>
+                  </pic:nvPicPr>
+                  <pic:blipFill>
+                    <a:blip r:embed="rId13">
+                      <a:extLst>
+                        <a:ext uri="{28A0092B-C50C-407E-A947-70E740481C1C}">
+                          <a14:useLocalDpi xmlns:a14="http://schemas.microsoft.com/office/drawing/2010/main" val="0"/>
+                        </a:ext>
+                      </a:extLst>
+                    </a:blip>
+                    <a:stretch>
+                      <a:fillRect/>
+                    </a:stretch>
+                  </pic:blipFill>
+                  <pic:spPr>
+                    <a:xfrm>
+                      <a:off x="0" y="0"/>
+                      <a:ext cx="6120130" cy="5854700"/>
+                    </a:xfrm>
+                    <a:prstGeom prst="rect">
+                      <a:avLst/>
+                    </a:prstGeom>
+                  </pic:spPr>
+                </pic:pic>
+              </a:graphicData>
+            </a:graphic>
+            <wp14:sizeRelH relativeFrom="page">
+              <wp14:pctWidth>0</wp14:pctWidth>
+            </wp14:sizeRelH>
+            <wp14:sizeRelV relativeFrom="page">
+              <wp14:pctHeight>0</wp14:pctHeight>
+            </wp14:sizeRelV>
+          </wp:anchor>
+        </w:drawing>
+      </w:r>
+      <w:r>
+        <w:rPr>
+          <w:sz w:val="28"/>
+          <w:szCs w:val="28"/>
+        </w:rPr>
+        <w:t>Рисунок 4</w:t>
+      </w:r>
+    </w:p>
+    <w:p>
+      <w:pPr>
+        <w:pStyle w:val="isselectedend"/>
+        <w:spacing w:before="0" w:beforeAutospacing="0" w:after="0" w:afterAutospacing="0" w:line="360" w:lineRule="auto"/>
+        <w:ind w:firstLine="709"/>
+        <w:jc w:val="center"/>
+        <w:rPr>
+          <w:sz w:val="28"/>
+          <w:szCs w:val="28"/>
+        </w:rPr>
+      </w:pPr>
+      <w:r>
+        <w:rPr>
+          <w:noProof/>
+        </w:rPr>
+        <w:lastRenderedPageBreak/>
+        <w:drawing>
+          <wp:inline distT="0" distB="0" distL="0" distR="0" wp14:anchorId="14A14E40" wp14:editId="69B72074">
+            <wp:extent cx="6120130" cy="3790950"/>
+            <wp:effectExtent l="0" t="0" r="0" b="0"/>
+            <wp:docPr id="11" name="Рисунок 11"/>
+            <wp:cNvGraphicFramePr>
+              <a:graphicFrameLocks xmlns:a="http://schemas.openxmlformats.org/drawingml/2006/main" noChangeAspect="1"/>
+            </wp:cNvGraphicFramePr>
+            <a:graphic xmlns:a="http://schemas.openxmlformats.org/drawingml/2006/main">
+              <a:graphicData uri="http://schemas.openxmlformats.org/drawingml/2006/picture">
+                <pic:pic xmlns:pic="http://schemas.openxmlformats.org/drawingml/2006/picture">
+                  <pic:nvPicPr>
+                    <pic:cNvPr id="1" name=""/>
+                    <pic:cNvPicPr/>
+                  </pic:nvPicPr>
+                  <pic:blipFill>
+                    <a:blip r:embed="rId14"/>
+                    <a:stretch>
+                      <a:fillRect/>
+                    </a:stretch>
+                  </pic:blipFill>
+                  <pic:spPr>
+                    <a:xfrm>
+                      <a:off x="0" y="0"/>
+                      <a:ext cx="6120130" cy="3790950"/>
+                    </a:xfrm>
+                    <a:prstGeom prst="rect">
+                      <a:avLst/>
+                    </a:prstGeom>
+                  </pic:spPr>
+                </pic:pic>
+              </a:graphicData>
+            </a:graphic>
+          </wp:inline>
+        </w:drawing>
+      </w:r>
+    </w:p>
+    <w:p>
+      <w:pPr>
+        <w:pStyle w:val="isselectedend"/>
+        <w:spacing w:before="0" w:beforeAutospacing="0" w:after="0" w:afterAutospacing="0" w:line="360" w:lineRule="auto"/>
+        <w:ind w:firstLine="709"/>
+        <w:jc w:val="center"/>
+        <w:rPr>
+          <w:sz w:val="28"/>
+          <w:szCs w:val="28"/>
+        </w:rPr>
+      </w:pPr>
+      <w:r>
+        <w:rPr>
+          <w:sz w:val="28"/>
+          <w:szCs w:val="28"/>
+        </w:rPr>
+        <w:t xml:space="preserve">Рисунок 5 </w:t>
+      </w:r>
+    </w:p>
+    <w:p>
+      <w:pPr>
+        <w:pStyle w:val="isselectedend"/>
+        <w:spacing w:before="0" w:beforeAutospacing="0" w:after="0" w:afterAutospacing="0" w:line="360" w:lineRule="auto"/>
+        <w:ind w:firstLine="709"/>
+        <w:rPr>
+          <w:sz w:val="28"/>
+          <w:szCs w:val="28"/>
+        </w:rPr>
+      </w:pPr>
+      <w:r>
+        <w:rPr>
+          <w:sz w:val="28"/>
+          <w:szCs w:val="28"/>
+        </w:rPr>
+        <w:t>База данных реализована на основе системы управления базами данных MySQL и соответствует структуре, используемой системой управления контентом WordPress.</w:t>
+      </w:r>
+    </w:p>
+    <w:p>
+      <w:pPr>
+        <w:pStyle w:val="isselectedend"/>
+        <w:spacing w:before="0" w:beforeAutospacing="0" w:after="0" w:afterAutospacing="0" w:line="360" w:lineRule="auto"/>
+        <w:ind w:firstLine="709"/>
+        <w:rPr>
+          <w:sz w:val="28"/>
+          <w:szCs w:val="28"/>
+        </w:rPr>
+      </w:pPr>
+      <w:r>
+        <w:rPr>
+          <w:sz w:val="28"/>
+          <w:szCs w:val="28"/>
+        </w:rPr>
+        <w:t>Для хранения комментариев используется таблица wp_comments, в которой содержатся текст комментария, данные автора, дата создания и другие параметры. Дополнительные данные о комментариях размещаются в таблице wp_commentmeta.</w:t>
+      </w:r>
+    </w:p>
+    <w:p>
+      <w:pPr>
+        <w:pStyle w:val="isselectedend"/>
+        <w:spacing w:before="0" w:beforeAutospacing="0" w:after="0" w:afterAutospacing="0" w:line="360" w:lineRule="auto"/>
+        <w:ind w:firstLine="709"/>
+        <w:rPr>
+          <w:sz w:val="28"/>
+          <w:szCs w:val="28"/>
+        </w:rPr>
+      </w:pPr>
+      <w:r>
+        <w:rPr>
+          <w:sz w:val="28"/>
+          <w:szCs w:val="28"/>
+        </w:rPr>
+        <w:t>Система категорий и тегов реализована с использованием таблиц wp_terms, wp_term_taxonomy и wp_term_relationships. Таблица wp_terms хранит названия категорий и тегов, wp_term_taxonomy определяет тип таксономии, а wp_term_relationships устанавливает связь между записями и соответствующими категориями или тегами.</w:t>
+      </w:r>
+    </w:p>
+    <w:p>
+      <w:pPr>
+        <w:pStyle w:val="isselectedend"/>
+        <w:spacing w:before="0" w:beforeAutospacing="0" w:after="0" w:afterAutospacing="0" w:line="360" w:lineRule="auto"/>
+        <w:ind w:firstLine="709"/>
+        <w:rPr>
+          <w:sz w:val="28"/>
+          <w:szCs w:val="28"/>
+        </w:rPr>
+      </w:pPr>
+      <w:r>
+        <w:rPr>
+          <w:sz w:val="28"/>
+          <w:szCs w:val="28"/>
+        </w:rPr>
+        <w:t>Дополнительные параметры системы хранятся в таблице wp_options, которая содержит настройки сайта, такие как параметры конфигурации, настройки темы и плагинов.</w:t>
+      </w:r>
+    </w:p>
+    <w:p>
+      <w:pPr>
+        <w:pStyle w:val="isselectedend"/>
+        <w:spacing w:before="0" w:beforeAutospacing="0" w:after="0" w:afterAutospacing="0" w:line="360" w:lineRule="auto"/>
+        <w:ind w:firstLine="709"/>
+        <w:rPr>
+          <w:sz w:val="28"/>
+          <w:szCs w:val="28"/>
+        </w:rPr>
+      </w:pPr>
+      <w:r>
+        <w:rPr>
+          <w:sz w:val="28"/>
+          <w:szCs w:val="28"/>
+        </w:rPr>
+        <w:lastRenderedPageBreak/>
+        <w:t>В базе данных также присутствуют таблицы, связанные с расширением функциональности системы, например, таблицы плагинов (в частности wp_links, wp_e_events), которые используются для реализации дополнительных возможностей сайта.</w:t>
       </w:r>
     </w:p>
     <w:p>
@@ -3221,7 +3961,151 @@
           <w:sz w:val="28"/>
           <w:szCs w:val="28"/>
         </w:rPr>
-        <w:t>В результате работы блока формируется структура сайта, которая передаётся для дальнейшего использования другим функциональным элементам системы. Основным механизмом выполнения данного процесса является администратор сайта.</w:t>
+        <w:t>Таким образом, разработанная ER-диаграмма отражает структуру базы данных сайта колледжа и демонстрирует взаимосвязь между основными сущностями системы. Использование данной структуры обеспечивает гибкость, расширяемость и удобство управления данными.</w:t>
+      </w:r>
+    </w:p>
+    <w:p>
+      <w:pPr>
+        <w:pStyle w:val="2"/>
+      </w:pPr>
+      <w:bookmarkStart w:id="9" w:name="_Toc225708681"/>
+      <w:r>
+        <w:t>Выбор программных средств реализаций</w:t>
+      </w:r>
+      <w:bookmarkEnd w:id="9"/>
+    </w:p>
+    <w:p>
+      <w:pPr>
+        <w:pStyle w:val="isselectedend"/>
+        <w:spacing w:before="0" w:beforeAutospacing="0" w:after="0" w:afterAutospacing="0" w:line="360" w:lineRule="auto"/>
+        <w:ind w:firstLine="709"/>
+        <w:rPr>
+          <w:sz w:val="28"/>
+          <w:szCs w:val="28"/>
+        </w:rPr>
+      </w:pPr>
+      <w:r>
+        <w:rPr>
+          <w:sz w:val="28"/>
+          <w:szCs w:val="28"/>
+        </w:rPr>
+        <w:t>При разработке информационной системы сайта колледжа необходимо выбрать программные средства, обеспечивающие удобную разработку, управление содержимым сайта и его дальнейшую поддержку. При выборе инструментов учитывались такие факторы, как удобство использования, распространённость технологий, наличие документации, а также возможность масштабирования и развития системы.</w:t>
+      </w:r>
+    </w:p>
+    <w:p>
+      <w:pPr>
+        <w:pStyle w:val="isselectedend"/>
+        <w:spacing w:before="0" w:beforeAutospacing="0" w:after="0" w:afterAutospacing="0" w:line="360" w:lineRule="auto"/>
+        <w:ind w:firstLine="709"/>
+        <w:rPr>
+          <w:sz w:val="28"/>
+          <w:szCs w:val="28"/>
+        </w:rPr>
+      </w:pPr>
+      <w:r>
+        <w:rPr>
+          <w:sz w:val="28"/>
+          <w:szCs w:val="28"/>
+        </w:rPr>
+        <w:t>В качестве основы для реализации веб-сайта была выбрана система управления контентом WordPress. Данная платформа является одной из наиболее популярных CMS в мире и широко применяется для создания различных типов веб-сайтов, включая информационные ресурсы образовательных учреждений.</w:t>
+      </w:r>
+    </w:p>
+    <w:p>
+      <w:pPr>
+        <w:pStyle w:val="isselectedend"/>
+        <w:spacing w:before="0" w:beforeAutospacing="0" w:after="0" w:afterAutospacing="0" w:line="360" w:lineRule="auto"/>
+        <w:ind w:firstLine="709"/>
+        <w:rPr>
+          <w:sz w:val="28"/>
+          <w:szCs w:val="28"/>
+        </w:rPr>
+      </w:pPr>
+      <w:r>
+        <w:rPr>
+          <w:sz w:val="28"/>
+          <w:szCs w:val="28"/>
+        </w:rPr>
+        <w:t>Использование системы управления контентом позволяет существенно упростить процесс разработки сайта. В отличие от создания веб-приложения с нуля, CMS предоставляет готовые инструменты для управления страницами, публикации новостей, работы с медиафайлами и настройки структуры сайта, что значительно сокращает время разработки и упрощает сопровождение ресурса.</w:t>
+      </w:r>
+    </w:p>
+    <w:p>
+      <w:pPr>
+        <w:pStyle w:val="isselectedend"/>
+        <w:spacing w:before="0" w:beforeAutospacing="0" w:after="0" w:afterAutospacing="0" w:line="360" w:lineRule="auto"/>
+        <w:ind w:firstLine="709"/>
+        <w:rPr>
+          <w:sz w:val="28"/>
+          <w:szCs w:val="28"/>
+        </w:rPr>
+      </w:pPr>
+      <w:r>
+        <w:rPr>
+          <w:sz w:val="28"/>
+          <w:szCs w:val="28"/>
+        </w:rPr>
+        <w:t>Система WordPress обладает рядом преимуществ. Во-первых, она имеет удобный административный интерфейс, позволяющий пользователям без глубоких знаний программирования добавлять и редактировать контент. Во-</w:t>
+      </w:r>
+      <w:r>
+        <w:rPr>
+          <w:sz w:val="28"/>
+          <w:szCs w:val="28"/>
+        </w:rPr>
+        <w:lastRenderedPageBreak/>
+        <w:t>вторых, поддерживается использование разнообразных тем оформления, что даёт возможность быстро изменять внешний вид сайта. В-третьих, платформа имеет большое количество плагинов, значительно расширяющих её функциональные возможности.</w:t>
+      </w:r>
+    </w:p>
+    <w:p>
+      <w:pPr>
+        <w:pStyle w:val="isselectedend"/>
+        <w:spacing w:before="0" w:beforeAutospacing="0" w:after="0" w:afterAutospacing="0" w:line="360" w:lineRule="auto"/>
+        <w:ind w:firstLine="709"/>
+        <w:rPr>
+          <w:sz w:val="28"/>
+          <w:szCs w:val="28"/>
+        </w:rPr>
+      </w:pPr>
+      <w:r>
+        <w:rPr>
+          <w:sz w:val="28"/>
+          <w:szCs w:val="28"/>
+        </w:rPr>
+        <w:t>Альтернативой при разработке сайта могли выступать другие системы управления контентом и конструкторы сайтов, такие как Joomla!, Drupal и Tilda. Однако каждая из них имеет определённые ограничения. Например, Joomla! и Drupal обладают более сложной структурой и требуют более глубоких технических знаний для настройки и поддержки. Это может усложнить работу администратора сайта в условиях образовательного учреждения.</w:t>
+      </w:r>
+    </w:p>
+    <w:p>
+      <w:pPr>
+        <w:pStyle w:val="isselectedend"/>
+        <w:spacing w:before="0" w:beforeAutospacing="0" w:after="0" w:afterAutospacing="0" w:line="360" w:lineRule="auto"/>
+        <w:ind w:firstLine="709"/>
+        <w:rPr>
+          <w:sz w:val="28"/>
+          <w:szCs w:val="28"/>
+        </w:rPr>
+      </w:pPr>
+      <w:r>
+        <w:rPr>
+          <w:sz w:val="28"/>
+          <w:szCs w:val="28"/>
+        </w:rPr>
+        <w:t>Конструктор сайтов Tilda, в свою очередь, отличается простотой использования и удобным визуальным редактором, однако имеет ограничения в гибкости настройки и расширении функционала. Кроме того, такие платформы часто зависят от подписки и не предоставляют полного контроля над системой и базой данных.</w:t>
+      </w:r>
+    </w:p>
+    <w:p>
+      <w:pPr>
+        <w:pStyle w:val="isselectedend"/>
+        <w:spacing w:before="0" w:beforeAutospacing="0" w:after="0" w:afterAutospacing="0" w:line="360" w:lineRule="auto"/>
+        <w:ind w:firstLine="709"/>
+        <w:rPr>
+          <w:sz w:val="28"/>
+          <w:szCs w:val="28"/>
+        </w:rPr>
+      </w:pPr>
+      <w:r>
+        <w:rPr>
+          <w:sz w:val="28"/>
+          <w:szCs w:val="28"/>
+        </w:rPr>
+        <w:t>В отличие от перечисленных решений, WordPress сочетает в себе простоту использования, гибкость настройки и широкие возможности расширения. Платформа является бесплатной, имеет большое сообщество разработчиков и обширную документацию, что упрощает процесс разработки и решения возможных проблем.</w:t>
       </w:r>
     </w:p>
     <w:p>
@@ -3239,21 +4123,25 @@
           <w:sz w:val="28"/>
           <w:szCs w:val="28"/>
         </w:rPr>
-        <w:t>Администратор определяет структуру разделов и подразделов сайта, а также при необходимости вносит изменения в организацию страниц в соответствии с потребностями образовательного учреждения.</w:t>
-      </w:r>
-      <w:r>
-        <w:rPr>
-          <w:sz w:val="28"/>
-          <w:szCs w:val="28"/>
-        </w:rPr>
-        <w:t xml:space="preserve"> </w:t>
-      </w:r>
-      <w:r>
-        <w:rPr>
-          <w:sz w:val="28"/>
-          <w:szCs w:val="28"/>
-        </w:rPr>
-        <w:t>Функциональный блок A2 предназначен для наполнения сайта информационными материалами. В рамках данного процесса осуществляется добавление новостей, загрузка медиафайлов, обновление расписания занятий и размещение информации о колледже.</w:t>
+        <w:t>Таким образом, выбор WordPress в качестве программной основы для реализации сайта колледжа является обоснованным, поскольку данная система обеспечивает оптимальное соотношение функциональности, удобства использования и возможностей дальнейшего развития проекта.</w:t>
+      </w:r>
+    </w:p>
+    <w:p>
+      <w:pPr>
+        <w:pStyle w:val="isselectedend"/>
+        <w:spacing w:before="0" w:beforeAutospacing="0" w:after="0" w:afterAutospacing="0" w:line="360" w:lineRule="auto"/>
+        <w:ind w:firstLine="709"/>
+        <w:rPr>
+          <w:sz w:val="28"/>
+          <w:szCs w:val="28"/>
+        </w:rPr>
+      </w:pPr>
+      <w:r>
+        <w:rPr>
+          <w:sz w:val="28"/>
+          <w:szCs w:val="28"/>
+        </w:rPr>
+        <w:t>Для хранения данных сайта используется система управления базами данных MySQL. Данная СУБД обеспечивает надёжное хранение информации и эффективную обработку запросов. Использование базы данных позволяет структурировать данные сайта, включая страницы, новости, пользователей и другие элементы системы.</w:t>
       </w:r>
     </w:p>
     <w:p>
@@ -3271,7 +4159,61 @@
           <w:sz w:val="28"/>
           <w:szCs w:val="28"/>
         </w:rPr>
-        <w:t>Входными данными для данного блока являются подготовленные информационные материалы и структура сайта, сформированная на предыдущем этапе. Управляющими элементами выступают техническое задание и требования законодательства.</w:t>
+        <w:lastRenderedPageBreak/>
+        <w:t xml:space="preserve">Для проектирования структуры базы данных использовался ранее рассмотренный инструмент </w:t>
+      </w:r>
+      <w:r>
+        <w:rPr>
+          <w:rStyle w:val="whitespace-normal"/>
+          <w:sz w:val="28"/>
+          <w:szCs w:val="28"/>
+        </w:rPr>
+        <w:t>MySQL Workbench</w:t>
+      </w:r>
+      <w:r>
+        <w:rPr>
+          <w:sz w:val="28"/>
+          <w:szCs w:val="28"/>
+        </w:rPr>
+        <w:t>, который предоставляет широкие возможности для построения ER-диаграмм, визуального моделирования структуры базы данных и последующей генерации её схемы</w:t>
+      </w:r>
+      <w:r>
+        <w:t>.</w:t>
+      </w:r>
+    </w:p>
+    <w:p>
+      <w:pPr>
+        <w:pStyle w:val="2"/>
+      </w:pPr>
+      <w:r>
+        <w:br w:type="page"/>
+      </w:r>
+      <w:r>
+        <w:lastRenderedPageBreak/>
+        <w:t xml:space="preserve"> </w:t>
+      </w:r>
+      <w:bookmarkStart w:id="10" w:name="_Toc225708682"/>
+      <w:r>
+        <w:t>Практическая реализация</w:t>
+      </w:r>
+      <w:bookmarkEnd w:id="10"/>
+    </w:p>
+    <w:p>
+      <w:pPr>
+        <w:pStyle w:val="isselectedend"/>
+        <w:spacing w:before="0" w:beforeAutospacing="0" w:after="0" w:afterAutospacing="0" w:line="360" w:lineRule="auto"/>
+        <w:ind w:firstLine="709"/>
+        <w:rPr>
+          <w:sz w:val="28"/>
+          <w:szCs w:val="28"/>
+        </w:rPr>
+      </w:pPr>
+      <w:r>
+        <w:rPr>
+          <w:sz w:val="28"/>
+          <w:szCs w:val="28"/>
+        </w:rPr>
+        <w:t>В рамках учебной практики была выполнена разработка информационной системы сайта колледжа с использованием системы управления контентом WordPress. Основной целью практической части являлось создание функционального веб-сайта, обеспечивающего удобное представление информации для пользователей и возможность управления контентом со стороны администратора.</w:t>
       </w:r>
     </w:p>
     <w:p>
@@ -3289,337 +4231,44 @@
           <w:sz w:val="28"/>
           <w:szCs w:val="28"/>
         </w:rPr>
-        <w:lastRenderedPageBreak/>
-        <w:t>Результатом работы блока является опубликованный контент сайта, включающий новости колледжа и страницы с актуальной информацией. Все операции выполняются администратором системы.</w:t>
-      </w:r>
-    </w:p>
-    <w:p>
-      <w:pPr>
-        <w:pStyle w:val="a5"/>
-        <w:spacing w:before="0" w:beforeAutospacing="0" w:after="0" w:afterAutospacing="0" w:line="360" w:lineRule="auto"/>
-        <w:ind w:firstLine="709"/>
-        <w:rPr>
-          <w:sz w:val="28"/>
-          <w:szCs w:val="28"/>
-        </w:rPr>
-      </w:pPr>
-      <w:r>
-        <w:rPr>
-          <w:sz w:val="28"/>
-          <w:szCs w:val="28"/>
-        </w:rPr>
-        <w:t>Перед публикацией информация может проходить проверку и предварительный просмотр, что позволяет избежать ошибок и обеспечить корректность размещаемых материалов.</w:t>
-      </w:r>
-      <w:r>
-        <w:rPr>
-          <w:sz w:val="28"/>
-          <w:szCs w:val="28"/>
-        </w:rPr>
-        <w:t xml:space="preserve"> </w:t>
-      </w:r>
-      <w:r>
-        <w:rPr>
-          <w:sz w:val="28"/>
-          <w:szCs w:val="28"/>
-        </w:rPr>
-        <w:t>Функциональный блок A3 обеспечивает взаимодействие пользователей с опубликованной информацией сайта. Пользователи могут просматривать новости колледжа, получать информацию о расписании занятий и переходить по различным разделам сайта.</w:t>
-      </w:r>
-    </w:p>
-    <w:p>
-      <w:pPr>
-        <w:pStyle w:val="a5"/>
-        <w:spacing w:before="0" w:beforeAutospacing="0" w:after="0" w:afterAutospacing="0" w:line="360" w:lineRule="auto"/>
-        <w:ind w:firstLine="709"/>
-        <w:rPr>
-          <w:sz w:val="28"/>
-          <w:szCs w:val="28"/>
-        </w:rPr>
-      </w:pPr>
-      <w:r>
-        <w:rPr>
-          <w:sz w:val="28"/>
-          <w:szCs w:val="28"/>
-        </w:rPr>
-        <w:t>Входными данными для данного процесса являются новости колледжа, план занятий и список страниц, сформированные на предыдущих этапах работы системы.</w:t>
-      </w:r>
-    </w:p>
-    <w:p>
-      <w:pPr>
-        <w:pStyle w:val="a5"/>
-        <w:spacing w:before="0" w:beforeAutospacing="0" w:after="0" w:afterAutospacing="0" w:line="360" w:lineRule="auto"/>
-        <w:ind w:firstLine="709"/>
-        <w:rPr>
-          <w:sz w:val="28"/>
-          <w:szCs w:val="28"/>
-        </w:rPr>
-      </w:pPr>
-      <w:r>
-        <w:rPr>
-          <w:sz w:val="28"/>
-          <w:szCs w:val="28"/>
-        </w:rPr>
-        <w:t>Основными механизмами выполнения процесса выступают пользователи системы — гость и администратор. Через веб-интерфейс они получают доступ к опубликованному контенту и могут просматривать необходимую информацию.</w:t>
+        <w:t>На начальном этапе была выполнена установка и настройка системы WordPress. Были заданы основные параметры сайта, включая название, структуру постоянных ссылок и базовые настройки отображения. После этого был выполнен выбор и установка темы оформления, соответствующей требованиям к внешнему виду сайта образовательного учреждения.</w:t>
       </w:r>
     </w:p>
     <w:p>
       <w:pPr>
         <w:pStyle w:val="2"/>
       </w:pPr>
-      <w:r>
-        <w:rPr>
-          <w:lang w:val="en-US"/>
-        </w:rPr>
-        <w:t xml:space="preserve">ER </w:t>
-      </w:r>
-      <w:r>
-        <w:t>диаграмма</w:t>
+    </w:p>
+    <w:p>
+      <w:pPr>
+        <w:rPr>
+          <w:rFonts w:ascii="Times New Roman" w:eastAsia="Times New Roman" w:hAnsi="Times New Roman" w:cs="Times New Roman"/>
+          <w:b/>
+          <w:bCs/>
+          <w:sz w:val="28"/>
+          <w:szCs w:val="36"/>
+          <w:lang w:eastAsia="ru-RU"/>
+        </w:rPr>
+      </w:pPr>
+      <w:r>
+        <w:br w:type="page"/>
       </w:r>
     </w:p>
     <w:p>
       <w:pPr>
         <w:pStyle w:val="2"/>
       </w:pPr>
-    </w:p>
-    <w:p>
-      <w:pPr>
-        <w:pStyle w:val="2"/>
-      </w:pPr>
-    </w:p>
-    <w:p>
-      <w:pPr>
-        <w:pStyle w:val="2"/>
-      </w:pPr>
-    </w:p>
-    <w:p>
-      <w:pPr>
-        <w:pStyle w:val="2"/>
-      </w:pPr>
-    </w:p>
-    <w:p>
-      <w:pPr>
-        <w:pStyle w:val="2"/>
-      </w:pPr>
-      <w:r>
-        <w:t>Выбор программных средств реализаций</w:t>
-      </w:r>
-    </w:p>
-    <w:p>
-      <w:pPr>
-        <w:pStyle w:val="isselectedend"/>
-        <w:spacing w:before="0" w:beforeAutospacing="0" w:after="0" w:afterAutospacing="0" w:line="360" w:lineRule="auto"/>
-        <w:ind w:firstLine="709"/>
-        <w:rPr>
-          <w:sz w:val="28"/>
-          <w:szCs w:val="28"/>
-        </w:rPr>
-      </w:pPr>
-      <w:r>
-        <w:rPr>
-          <w:sz w:val="28"/>
-          <w:szCs w:val="28"/>
-        </w:rPr>
-        <w:t>При разработке информационной системы сайта колледжа необходимо выбрать программные средства, обеспечивающие удобную разработку, управление содержимым сайта и дальнейшую поддержку системы. При выборе инструментов учитывались такие факторы, как удобство использования, распространённость технологий, наличие документации, а также возможность дальнейшего развития и сопровождения системы.</w:t>
-      </w:r>
-    </w:p>
-    <w:p>
-      <w:pPr>
-        <w:pStyle w:val="isselectedend"/>
-        <w:spacing w:before="0" w:beforeAutospacing="0" w:after="0" w:afterAutospacing="0" w:line="360" w:lineRule="auto"/>
-        <w:ind w:firstLine="709"/>
-        <w:rPr>
-          <w:sz w:val="28"/>
-          <w:szCs w:val="28"/>
-        </w:rPr>
-      </w:pPr>
-      <w:r>
-        <w:rPr>
-          <w:sz w:val="28"/>
-          <w:szCs w:val="28"/>
-        </w:rPr>
-        <w:lastRenderedPageBreak/>
-        <w:t>В качестве основы для реализации веб-сайта была выбрана система управления контентом WordPress. Данная платформа является одной из наиболее популярных CMS в мире и широко применяется для создания различных типов веб-сайтов, включая информационные порталы образовательных учреждений.</w:t>
-      </w:r>
-    </w:p>
-    <w:p>
-      <w:pPr>
-        <w:pStyle w:val="isselectedend"/>
-        <w:spacing w:before="0" w:beforeAutospacing="0" w:after="0" w:afterAutospacing="0" w:line="360" w:lineRule="auto"/>
-        <w:ind w:firstLine="709"/>
-        <w:rPr>
-          <w:sz w:val="28"/>
-          <w:szCs w:val="28"/>
-        </w:rPr>
-      </w:pPr>
-      <w:r>
-        <w:rPr>
-          <w:sz w:val="28"/>
-          <w:szCs w:val="28"/>
-        </w:rPr>
-        <w:t>Использование системы управления контентом позволяет существенно упростить процесс разработки сайта. В отличие от разработки веб-приложения с нуля, CMS предоставляет готовый набор инструментов для управления страницами, публикации новостей, работы с медиафайлами и настройки структуры сайта. Это значительно сокращает время разработки и упрощает дальнейшее сопровождение ресурса.</w:t>
-      </w:r>
-    </w:p>
-    <w:p>
-      <w:pPr>
-        <w:pStyle w:val="isselectedend"/>
-        <w:spacing w:before="0" w:beforeAutospacing="0" w:after="0" w:afterAutospacing="0" w:line="360" w:lineRule="auto"/>
-        <w:ind w:firstLine="709"/>
-        <w:rPr>
-          <w:sz w:val="28"/>
-          <w:szCs w:val="28"/>
-        </w:rPr>
-      </w:pPr>
-      <w:r>
-        <w:rPr>
-          <w:sz w:val="28"/>
-          <w:szCs w:val="28"/>
-        </w:rPr>
-        <w:t>Система WordPress обладает рядом преимуществ. Во-первых, она имеет удобный административный интерфейс, который позволяет пользователю без специальных навыков программирования добавлять и редактировать содержимое сайта. Во-вторых, система поддерживает использование различных тем оформления, что позволяет быстро изменить внешний вид сайта. В-третьих, платформа имеет большое количество плагинов, расширяющих функциональные возможности системы.</w:t>
-      </w:r>
-    </w:p>
-    <w:p>
-      <w:pPr>
-        <w:pStyle w:val="isselectedend"/>
-        <w:spacing w:before="0" w:beforeAutospacing="0" w:after="0" w:afterAutospacing="0" w:line="360" w:lineRule="auto"/>
-        <w:ind w:firstLine="709"/>
-        <w:rPr>
-          <w:sz w:val="28"/>
-          <w:szCs w:val="28"/>
-        </w:rPr>
-      </w:pPr>
-      <w:r>
-        <w:rPr>
-          <w:sz w:val="28"/>
-          <w:szCs w:val="28"/>
-        </w:rPr>
-        <w:t>Для хранения данных сайта используется система управления базами данных MySQL. Данная СУБД обеспечивает надёжное хранение информации и эффективную обработку запросов. Использование базы данных позволяет структурировать данные сайта, включая страницы, новости, пользователей и другие элементы системы.</w:t>
-      </w:r>
-    </w:p>
-    <w:p>
-      <w:pPr>
-        <w:pStyle w:val="a5"/>
-        <w:spacing w:before="0" w:beforeAutospacing="0" w:after="0" w:afterAutospacing="0" w:line="360" w:lineRule="auto"/>
-        <w:ind w:firstLine="709"/>
-        <w:rPr>
-          <w:sz w:val="28"/>
-          <w:szCs w:val="28"/>
-        </w:rPr>
-      </w:pPr>
-      <w:r>
-        <w:rPr>
-          <w:sz w:val="28"/>
-          <w:szCs w:val="28"/>
-        </w:rPr>
-        <w:t>Для проектирования структуры базы данных была использована программа MySQL Workbench. Данный инструмент предоставляет удобные средства для создания ER-диаграмм, визуального моделирования структуры базы данных и последующей генерации схемы базы данных.</w:t>
-      </w:r>
-    </w:p>
-    <w:p>
-      <w:pPr>
-        <w:pStyle w:val="2"/>
-      </w:pPr>
-    </w:p>
-    <w:p>
-      <w:pPr>
-        <w:pStyle w:val="a5"/>
-        <w:spacing w:before="0" w:beforeAutospacing="0" w:after="0" w:afterAutospacing="0" w:line="360" w:lineRule="auto"/>
-        <w:ind w:firstLine="709"/>
-        <w:rPr>
-          <w:sz w:val="28"/>
-          <w:szCs w:val="28"/>
-        </w:rPr>
-      </w:pPr>
-    </w:p>
-    <w:p>
-      <w:pPr>
-        <w:pStyle w:val="a5"/>
-        <w:spacing w:before="0" w:beforeAutospacing="0" w:after="0" w:afterAutospacing="0" w:line="360" w:lineRule="auto"/>
-        <w:ind w:firstLine="709"/>
-        <w:rPr>
-          <w:sz w:val="28"/>
-          <w:szCs w:val="28"/>
-        </w:rPr>
-      </w:pPr>
-    </w:p>
-    <w:p>
-      <w:pPr>
-        <w:pStyle w:val="a5"/>
-        <w:spacing w:before="0" w:beforeAutospacing="0" w:after="0" w:afterAutospacing="0" w:line="360" w:lineRule="auto"/>
-        <w:ind w:firstLine="709"/>
-        <w:rPr>
-          <w:sz w:val="28"/>
-          <w:szCs w:val="28"/>
-        </w:rPr>
-      </w:pPr>
-    </w:p>
-    <w:p>
-      <w:pPr>
-        <w:pStyle w:val="a5"/>
-        <w:spacing w:before="0" w:beforeAutospacing="0" w:after="0" w:afterAutospacing="0" w:line="360" w:lineRule="auto"/>
-        <w:ind w:firstLine="709"/>
-      </w:pPr>
-    </w:p>
-    <w:p>
-      <w:pPr>
-        <w:pStyle w:val="2"/>
-      </w:pPr>
-    </w:p>
-    <w:p>
-      <w:pPr>
-        <w:pStyle w:val="a5"/>
-        <w:spacing w:before="0" w:beforeAutospacing="0" w:after="0" w:afterAutospacing="0" w:line="360" w:lineRule="auto"/>
-        <w:ind w:firstLine="709"/>
-        <w:rPr>
-          <w:sz w:val="28"/>
-          <w:szCs w:val="28"/>
-        </w:rPr>
-      </w:pPr>
-    </w:p>
-    <w:p>
-      <w:pPr>
-        <w:pStyle w:val="a5"/>
-        <w:spacing w:before="0" w:beforeAutospacing="0" w:after="0" w:afterAutospacing="0" w:line="360" w:lineRule="auto"/>
-        <w:ind w:firstLine="709"/>
-        <w:rPr>
-          <w:sz w:val="28"/>
-          <w:szCs w:val="28"/>
-        </w:rPr>
-      </w:pPr>
-      <w:r>
-        <w:rPr>
-          <w:sz w:val="28"/>
-          <w:szCs w:val="28"/>
-        </w:rPr>
-        <w:br/>
-        <w:t xml:space="preserve"> </w:t>
-      </w:r>
-    </w:p>
-    <w:p>
-      <w:pPr>
-        <w:pStyle w:val="2"/>
-      </w:pPr>
-      <w:r>
-        <w:br w:type="page"/>
-      </w:r>
-      <w:r>
-        <w:lastRenderedPageBreak/>
-        <w:t xml:space="preserve"> </w:t>
-      </w:r>
     </w:p>
     <w:p>
       <w:pPr>
         <w:pStyle w:val="1"/>
         <w:jc w:val="center"/>
-        <w:rPr>
-          <w:sz w:val="28"/>
-        </w:rPr>
-      </w:pPr>
-      <w:bookmarkStart w:id="8" w:name="_Toc224494896"/>
-      <w:r>
-        <w:rPr>
-          <w:sz w:val="28"/>
-        </w:rPr>
+      </w:pPr>
+      <w:bookmarkStart w:id="11" w:name="_Toc225708683"/>
+      <w:r>
         <w:t>ЗАКЛЮЧЕНИЕ</w:t>
       </w:r>
-      <w:bookmarkEnd w:id="8"/>
+      <w:bookmarkEnd w:id="11"/>
     </w:p>
     <w:p>
       <w:pPr>
@@ -3846,23 +4495,21 @@
         <w:jc w:val="center"/>
         <w:rPr>
           <w:rFonts w:eastAsiaTheme="majorEastAsia"/>
-          <w:sz w:val="28"/>
-          <w:szCs w:val="28"/>
-        </w:rPr>
-      </w:pPr>
-      <w:bookmarkStart w:id="9" w:name="_Toc161611545"/>
-      <w:bookmarkStart w:id="10" w:name="_Toc224494897"/>
+          <w:szCs w:val="28"/>
+        </w:rPr>
+      </w:pPr>
+      <w:bookmarkStart w:id="12" w:name="_Toc161611545"/>
+      <w:bookmarkStart w:id="13" w:name="_Toc225708684"/>
       <w:r>
         <w:rPr>
           <w:rFonts w:eastAsiaTheme="majorEastAsia"/>
-          <w:sz w:val="28"/>
           <w:szCs w:val="28"/>
         </w:rPr>
         <w:lastRenderedPageBreak/>
         <w:t>СПИСОК ИСПОЛЬЗОВАННЫХ ИСТОЧНИКОВ</w:t>
       </w:r>
-      <w:bookmarkEnd w:id="9"/>
-      <w:bookmarkEnd w:id="10"/>
+      <w:bookmarkEnd w:id="12"/>
+      <w:bookmarkEnd w:id="13"/>
     </w:p>
     <w:p>
       <w:pPr>
@@ -3919,7 +4566,7 @@
       </w:r>
     </w:p>
     <w:sectPr>
-      <w:footerReference w:type="default" r:id="rId13"/>
+      <w:footerReference w:type="default" r:id="rId15"/>
       <w:pgSz w:w="11906" w:h="16838"/>
       <w:pgMar w:top="1134" w:right="567" w:bottom="1134" w:left="1701" w:header="709" w:footer="709" w:gutter="0"/>
       <w:cols w:space="708"/>
@@ -4006,7 +4653,7 @@
             <w:noProof/>
             <w:sz w:val="28"/>
           </w:rPr>
-          <w:t>12</w:t>
+          <w:t>2</w:t>
         </w:r>
         <w:r>
           <w:rPr>
@@ -4939,6 +5586,93 @@
     </w:lvl>
   </w:abstractNum>
   <w:abstractNum w:abstractNumId="7" w15:restartNumberingAfterBreak="0">
+    <w:nsid w:val="30F320ED"/>
+    <w:multiLevelType w:val="hybridMultilevel"/>
+    <w:tmpl w:val="36C813A4"/>
+    <w:lvl w:ilvl="0" w:tplc="EDE03F3C">
+      <w:start w:val="1"/>
+      <w:numFmt w:val="decimal"/>
+      <w:pStyle w:val="1"/>
+      <w:lvlText w:val="%1)"/>
+      <w:lvlJc w:val="left"/>
+      <w:pPr>
+        <w:ind w:left="720" w:hanging="360"/>
+      </w:pPr>
+    </w:lvl>
+    <w:lvl w:ilvl="1" w:tplc="04190019" w:tentative="1">
+      <w:start w:val="1"/>
+      <w:numFmt w:val="lowerLetter"/>
+      <w:lvlText w:val="%2."/>
+      <w:lvlJc w:val="left"/>
+      <w:pPr>
+        <w:ind w:left="1440" w:hanging="360"/>
+      </w:pPr>
+    </w:lvl>
+    <w:lvl w:ilvl="2" w:tplc="0419001B" w:tentative="1">
+      <w:start w:val="1"/>
+      <w:numFmt w:val="lowerRoman"/>
+      <w:lvlText w:val="%3."/>
+      <w:lvlJc w:val="right"/>
+      <w:pPr>
+        <w:ind w:left="2160" w:hanging="180"/>
+      </w:pPr>
+    </w:lvl>
+    <w:lvl w:ilvl="3" w:tplc="0419000F" w:tentative="1">
+      <w:start w:val="1"/>
+      <w:numFmt w:val="decimal"/>
+      <w:lvlText w:val="%4."/>
+      <w:lvlJc w:val="left"/>
+      <w:pPr>
+        <w:ind w:left="2880" w:hanging="360"/>
+      </w:pPr>
+    </w:lvl>
+    <w:lvl w:ilvl="4" w:tplc="04190019" w:tentative="1">
+      <w:start w:val="1"/>
+      <w:numFmt w:val="lowerLetter"/>
+      <w:lvlText w:val="%5."/>
+      <w:lvlJc w:val="left"/>
+      <w:pPr>
+        <w:ind w:left="3600" w:hanging="360"/>
+      </w:pPr>
+    </w:lvl>
+    <w:lvl w:ilvl="5" w:tplc="0419001B" w:tentative="1">
+      <w:start w:val="1"/>
+      <w:numFmt w:val="lowerRoman"/>
+      <w:lvlText w:val="%6."/>
+      <w:lvlJc w:val="right"/>
+      <w:pPr>
+        <w:ind w:left="4320" w:hanging="180"/>
+      </w:pPr>
+    </w:lvl>
+    <w:lvl w:ilvl="6" w:tplc="0419000F" w:tentative="1">
+      <w:start w:val="1"/>
+      <w:numFmt w:val="decimal"/>
+      <w:lvlText w:val="%7."/>
+      <w:lvlJc w:val="left"/>
+      <w:pPr>
+        <w:ind w:left="5040" w:hanging="360"/>
+      </w:pPr>
+    </w:lvl>
+    <w:lvl w:ilvl="7" w:tplc="04190019" w:tentative="1">
+      <w:start w:val="1"/>
+      <w:numFmt w:val="lowerLetter"/>
+      <w:lvlText w:val="%8."/>
+      <w:lvlJc w:val="left"/>
+      <w:pPr>
+        <w:ind w:left="5760" w:hanging="360"/>
+      </w:pPr>
+    </w:lvl>
+    <w:lvl w:ilvl="8" w:tplc="0419001B" w:tentative="1">
+      <w:start w:val="1"/>
+      <w:numFmt w:val="lowerRoman"/>
+      <w:lvlText w:val="%9."/>
+      <w:lvlJc w:val="right"/>
+      <w:pPr>
+        <w:ind w:left="6480" w:hanging="180"/>
+      </w:pPr>
+    </w:lvl>
+  </w:abstractNum>
+  <w:abstractNum w:abstractNumId="8" w15:restartNumberingAfterBreak="0">
     <w:nsid w:val="42806BE6"/>
     <w:multiLevelType w:val="multilevel"/>
     <w:tmpl w:val="59D6EA9A"/>
@@ -5087,7 +5821,93 @@
       </w:rPr>
     </w:lvl>
   </w:abstractNum>
-  <w:abstractNum w:abstractNumId="8" w15:restartNumberingAfterBreak="0">
+  <w:abstractNum w:abstractNumId="9" w15:restartNumberingAfterBreak="0">
+    <w:nsid w:val="42B601E8"/>
+    <w:multiLevelType w:val="hybridMultilevel"/>
+    <w:tmpl w:val="A2E0F54C"/>
+    <w:lvl w:ilvl="0" w:tplc="AA42465C">
+      <w:start w:val="1"/>
+      <w:numFmt w:val="decimal"/>
+      <w:lvlText w:val="%1."/>
+      <w:lvlJc w:val="left"/>
+      <w:pPr>
+        <w:ind w:left="720" w:hanging="360"/>
+      </w:pPr>
+    </w:lvl>
+    <w:lvl w:ilvl="1" w:tplc="04190019" w:tentative="1">
+      <w:start w:val="1"/>
+      <w:numFmt w:val="lowerLetter"/>
+      <w:lvlText w:val="%2."/>
+      <w:lvlJc w:val="left"/>
+      <w:pPr>
+        <w:ind w:left="1440" w:hanging="360"/>
+      </w:pPr>
+    </w:lvl>
+    <w:lvl w:ilvl="2" w:tplc="0419001B" w:tentative="1">
+      <w:start w:val="1"/>
+      <w:numFmt w:val="lowerRoman"/>
+      <w:lvlText w:val="%3."/>
+      <w:lvlJc w:val="right"/>
+      <w:pPr>
+        <w:ind w:left="2160" w:hanging="180"/>
+      </w:pPr>
+    </w:lvl>
+    <w:lvl w:ilvl="3" w:tplc="0419000F" w:tentative="1">
+      <w:start w:val="1"/>
+      <w:numFmt w:val="decimal"/>
+      <w:lvlText w:val="%4."/>
+      <w:lvlJc w:val="left"/>
+      <w:pPr>
+        <w:ind w:left="2880" w:hanging="360"/>
+      </w:pPr>
+    </w:lvl>
+    <w:lvl w:ilvl="4" w:tplc="04190019" w:tentative="1">
+      <w:start w:val="1"/>
+      <w:numFmt w:val="lowerLetter"/>
+      <w:lvlText w:val="%5."/>
+      <w:lvlJc w:val="left"/>
+      <w:pPr>
+        <w:ind w:left="3600" w:hanging="360"/>
+      </w:pPr>
+    </w:lvl>
+    <w:lvl w:ilvl="5" w:tplc="0419001B" w:tentative="1">
+      <w:start w:val="1"/>
+      <w:numFmt w:val="lowerRoman"/>
+      <w:lvlText w:val="%6."/>
+      <w:lvlJc w:val="right"/>
+      <w:pPr>
+        <w:ind w:left="4320" w:hanging="180"/>
+      </w:pPr>
+    </w:lvl>
+    <w:lvl w:ilvl="6" w:tplc="0419000F" w:tentative="1">
+      <w:start w:val="1"/>
+      <w:numFmt w:val="decimal"/>
+      <w:lvlText w:val="%7."/>
+      <w:lvlJc w:val="left"/>
+      <w:pPr>
+        <w:ind w:left="5040" w:hanging="360"/>
+      </w:pPr>
+    </w:lvl>
+    <w:lvl w:ilvl="7" w:tplc="04190019" w:tentative="1">
+      <w:start w:val="1"/>
+      <w:numFmt w:val="lowerLetter"/>
+      <w:lvlText w:val="%8."/>
+      <w:lvlJc w:val="left"/>
+      <w:pPr>
+        <w:ind w:left="5760" w:hanging="360"/>
+      </w:pPr>
+    </w:lvl>
+    <w:lvl w:ilvl="8" w:tplc="0419001B" w:tentative="1">
+      <w:start w:val="1"/>
+      <w:numFmt w:val="lowerRoman"/>
+      <w:lvlText w:val="%9."/>
+      <w:lvlJc w:val="right"/>
+      <w:pPr>
+        <w:ind w:left="6480" w:hanging="180"/>
+      </w:pPr>
+    </w:lvl>
+  </w:abstractNum>
+  <w:abstractNum w:abstractNumId="10" w15:restartNumberingAfterBreak="0">
     <w:nsid w:val="48FA6313"/>
     <w:multiLevelType w:val="hybridMultilevel"/>
     <w:tmpl w:val="1884CE48"/>
@@ -5200,7 +6020,7 @@
       </w:rPr>
     </w:lvl>
   </w:abstractNum>
-  <w:abstractNum w:abstractNumId="9" w15:restartNumberingAfterBreak="0">
+  <w:abstractNum w:abstractNumId="11" w15:restartNumberingAfterBreak="0">
     <w:nsid w:val="532E61FB"/>
     <w:multiLevelType w:val="hybridMultilevel"/>
     <w:tmpl w:val="3392CE6A"/>
@@ -5289,7 +6109,7 @@
       </w:pPr>
     </w:lvl>
   </w:abstractNum>
-  <w:abstractNum w:abstractNumId="10" w15:restartNumberingAfterBreak="0">
+  <w:abstractNum w:abstractNumId="12" w15:restartNumberingAfterBreak="0">
     <w:nsid w:val="53F23E31"/>
     <w:multiLevelType w:val="multilevel"/>
     <w:tmpl w:val="49A4B11A"/>
@@ -5438,7 +6258,7 @@
       </w:rPr>
     </w:lvl>
   </w:abstractNum>
-  <w:abstractNum w:abstractNumId="11" w15:restartNumberingAfterBreak="0">
+  <w:abstractNum w:abstractNumId="13" w15:restartNumberingAfterBreak="0">
     <w:nsid w:val="59432DC5"/>
     <w:multiLevelType w:val="hybridMultilevel"/>
     <w:tmpl w:val="5388F2AE"/>
@@ -5551,7 +6371,7 @@
       </w:rPr>
     </w:lvl>
   </w:abstractNum>
-  <w:abstractNum w:abstractNumId="12" w15:restartNumberingAfterBreak="0">
+  <w:abstractNum w:abstractNumId="14" w15:restartNumberingAfterBreak="0">
     <w:nsid w:val="59D872F5"/>
     <w:multiLevelType w:val="multilevel"/>
     <w:tmpl w:val="C8482C96"/>
@@ -5700,7 +6520,7 @@
       </w:rPr>
     </w:lvl>
   </w:abstractNum>
-  <w:abstractNum w:abstractNumId="13" w15:restartNumberingAfterBreak="0">
+  <w:abstractNum w:abstractNumId="15" w15:restartNumberingAfterBreak="0">
     <w:nsid w:val="5A44292F"/>
     <w:multiLevelType w:val="hybridMultilevel"/>
     <w:tmpl w:val="400A16DC"/>
@@ -5814,7 +6634,7 @@
       </w:rPr>
     </w:lvl>
   </w:abstractNum>
-  <w:abstractNum w:abstractNumId="14" w15:restartNumberingAfterBreak="0">
+  <w:abstractNum w:abstractNumId="16" w15:restartNumberingAfterBreak="0">
     <w:nsid w:val="6B9D2BBD"/>
     <w:multiLevelType w:val="hybridMultilevel"/>
     <w:tmpl w:val="56626378"/>
@@ -5903,7 +6723,7 @@
       </w:pPr>
     </w:lvl>
   </w:abstractNum>
-  <w:abstractNum w:abstractNumId="15" w15:restartNumberingAfterBreak="0">
+  <w:abstractNum w:abstractNumId="17" w15:restartNumberingAfterBreak="0">
     <w:nsid w:val="6E660CFE"/>
     <w:multiLevelType w:val="multilevel"/>
     <w:tmpl w:val="4F003F5E"/>
@@ -6052,7 +6872,7 @@
       </w:rPr>
     </w:lvl>
   </w:abstractNum>
-  <w:abstractNum w:abstractNumId="16" w15:restartNumberingAfterBreak="0">
+  <w:abstractNum w:abstractNumId="18" w15:restartNumberingAfterBreak="0">
     <w:nsid w:val="71FA5772"/>
     <w:multiLevelType w:val="multilevel"/>
     <w:tmpl w:val="D3829E26"/>
@@ -6201,7 +7021,7 @@
       </w:rPr>
     </w:lvl>
   </w:abstractNum>
-  <w:abstractNum w:abstractNumId="17" w15:restartNumberingAfterBreak="0">
+  <w:abstractNum w:abstractNumId="19" w15:restartNumberingAfterBreak="0">
     <w:nsid w:val="7BD7319F"/>
     <w:multiLevelType w:val="hybridMultilevel"/>
     <w:tmpl w:val="C0945F86"/>
@@ -6314,7 +7134,7 @@
       </w:rPr>
     </w:lvl>
   </w:abstractNum>
-  <w:abstractNum w:abstractNumId="18" w15:restartNumberingAfterBreak="0">
+  <w:abstractNum w:abstractNumId="20" w15:restartNumberingAfterBreak="0">
     <w:nsid w:val="7F27452D"/>
     <w:multiLevelType w:val="hybridMultilevel"/>
     <w:tmpl w:val="2DB85594"/>
@@ -6434,31 +7254,31 @@
     <w:abstractNumId w:val="2"/>
   </w:num>
   <w:num w:numId="3">
-    <w:abstractNumId w:val="9"/>
+    <w:abstractNumId w:val="11"/>
   </w:num>
   <w:num w:numId="4">
-    <w:abstractNumId w:val="14"/>
+    <w:abstractNumId w:val="16"/>
   </w:num>
   <w:num w:numId="5">
-    <w:abstractNumId w:val="8"/>
+    <w:abstractNumId w:val="10"/>
   </w:num>
   <w:num w:numId="6">
-    <w:abstractNumId w:val="13"/>
+    <w:abstractNumId w:val="15"/>
   </w:num>
   <w:num w:numId="7">
     <w:abstractNumId w:val="5"/>
   </w:num>
   <w:num w:numId="8">
-    <w:abstractNumId w:val="11"/>
+    <w:abstractNumId w:val="13"/>
   </w:num>
   <w:num w:numId="9">
-    <w:abstractNumId w:val="10"/>
+    <w:abstractNumId w:val="12"/>
   </w:num>
   <w:num w:numId="10">
-    <w:abstractNumId w:val="7"/>
+    <w:abstractNumId w:val="8"/>
   </w:num>
   <w:num w:numId="11">
-    <w:abstractNumId w:val="12"/>
+    <w:abstractNumId w:val="14"/>
   </w:num>
   <w:num w:numId="12">
     <w:abstractNumId w:val="0"/>
@@ -6467,22 +7287,28 @@
     <w:abstractNumId w:val="4"/>
   </w:num>
   <w:num w:numId="14">
-    <w:abstractNumId w:val="18"/>
+    <w:abstractNumId w:val="20"/>
   </w:num>
   <w:num w:numId="15">
-    <w:abstractNumId w:val="17"/>
+    <w:abstractNumId w:val="19"/>
   </w:num>
   <w:num w:numId="16">
     <w:abstractNumId w:val="1"/>
   </w:num>
   <w:num w:numId="17">
-    <w:abstractNumId w:val="16"/>
+    <w:abstractNumId w:val="18"/>
   </w:num>
   <w:num w:numId="18">
-    <w:abstractNumId w:val="15"/>
+    <w:abstractNumId w:val="17"/>
   </w:num>
   <w:num w:numId="19">
     <w:abstractNumId w:val="6"/>
+  </w:num>
+  <w:num w:numId="20">
+    <w:abstractNumId w:val="9"/>
+  </w:num>
+  <w:num w:numId="21">
+    <w:abstractNumId w:val="7"/>
   </w:num>
 </w:numbering>
 </file>
@@ -6887,8 +7713,11 @@
     <w:link w:val="10"/>
     <w:uiPriority w:val="9"/>
     <w:qFormat/>
-    <w:rsid w:val="009002B6"/>
+    <w:rsid w:val="00715B7A"/>
     <w:pPr>
+      <w:numPr>
+        <w:numId w:val="21"/>
+      </w:numPr>
       <w:spacing w:before="100" w:beforeAutospacing="1" w:after="100" w:afterAutospacing="1" w:line="240" w:lineRule="auto"/>
       <w:outlineLvl w:val="0"/>
     </w:pPr>
@@ -6897,7 +7726,7 @@
       <w:b/>
       <w:bCs/>
       <w:kern w:val="36"/>
-      <w:sz w:val="48"/>
+      <w:sz w:val="28"/>
       <w:szCs w:val="48"/>
       <w:lang w:eastAsia="ru-RU"/>
     </w:rPr>
@@ -6908,7 +7737,7 @@
     <w:link w:val="20"/>
     <w:uiPriority w:val="9"/>
     <w:qFormat/>
-    <w:rsid w:val="00866851"/>
+    <w:rsid w:val="00715B7A"/>
     <w:pPr>
       <w:spacing w:before="100" w:beforeAutospacing="1" w:after="100" w:afterAutospacing="1" w:line="240" w:lineRule="auto"/>
       <w:outlineLvl w:val="1"/>
@@ -6996,7 +7825,6 @@
     <w:name w:val="Normal (Web)"/>
     <w:basedOn w:val="a"/>
     <w:uiPriority w:val="99"/>
-    <w:semiHidden/>
     <w:unhideWhenUsed/>
     <w:rsid w:val="00406289"/>
     <w:pPr>
@@ -7049,13 +7877,13 @@
     <w:basedOn w:val="a0"/>
     <w:link w:val="1"/>
     <w:uiPriority w:val="9"/>
-    <w:rsid w:val="009002B6"/>
+    <w:rsid w:val="00715B7A"/>
     <w:rPr>
       <w:rFonts w:ascii="Times New Roman" w:eastAsia="Times New Roman" w:hAnsi="Times New Roman" w:cs="Times New Roman"/>
       <w:b/>
       <w:bCs/>
       <w:kern w:val="36"/>
-      <w:sz w:val="48"/>
+      <w:sz w:val="28"/>
       <w:szCs w:val="48"/>
       <w:lang w:eastAsia="ru-RU"/>
     </w:rPr>
@@ -7236,6 +8064,11 @@
       <w:spacing w:after="100"/>
       <w:ind w:left="440"/>
     </w:pPr>
+  </w:style>
+  <w:style w:type="character" w:customStyle="1" w:styleId="whitespace-normal">
+    <w:name w:val="whitespace-normal"/>
+    <w:basedOn w:val="a0"/>
+    <w:rsid w:val="008A0F71"/>
   </w:style>
 </w:styles>
 </file>
@@ -7506,7 +8339,7 @@
 </file>
 
 <file path=customXml/itemProps1.xml><?xml version="1.0" encoding="utf-8"?>
-<ds:datastoreItem xmlns:ds="http://schemas.openxmlformats.org/officeDocument/2006/customXml" ds:itemID="{0B27C126-3A92-4D9F-89F1-F2E4C2AA36EA}">
+<ds:datastoreItem xmlns:ds="http://schemas.openxmlformats.org/officeDocument/2006/customXml" ds:itemID="{37321AE1-FA11-4399-8E3E-28F1AB8C8D9E}">
   <ds:schemaRefs>
     <ds:schemaRef ds:uri="http://schemas.openxmlformats.org/officeDocument/2006/bibliography"/>
   </ds:schemaRefs>

</xml_diff>